<commit_message>
Update TPI - 2do commit
Update del informe
</commit_message>
<xml_diff>
--- a/Informe Trabajo Práctico Integrador - OE.docx
+++ b/Informe Trabajo Práctico Integrador - OE.docx
@@ -545,54 +545,40 @@
     <w:p>
       <w:pPr>
         <w:rPr>
-          <w:sz w:val="24"/>
-          <w:szCs w:val="24"/>
-          <w:lang w:val="es-AR"/>
-        </w:rPr>
-      </w:pPr>
-    </w:p>
-    <w:p>
-      <w:pPr>
-        <w:pStyle w:val="Ttulo1"/>
-        <w:rPr>
-          <w:lang w:val="es-AR"/>
-        </w:rPr>
-      </w:pPr>
-      <w:r>
-        <w:rPr>
-          <w:lang w:val="es-AR"/>
-        </w:rPr>
-        <w:t>BASE DE DATOS</w:t>
-      </w:r>
-    </w:p>
-    <w:p>
-      <w:pPr>
-        <w:rPr>
           <w:b/>
           <w:bCs/>
-          <w:lang w:val="es-AR"/>
-        </w:rPr>
-      </w:pPr>
-      <w:r>
-        <w:rPr>
-          <w:lang w:val="es-AR"/>
-        </w:rPr>
-        <w:t>usuarios.csv</w:t>
-      </w:r>
-    </w:p>
-    <w:p>
-      <w:pPr>
+          <w:sz w:val="24"/>
+          <w:szCs w:val="24"/>
+          <w:lang w:val="es-AR"/>
+        </w:rPr>
+      </w:pPr>
+      <w:r>
         <w:rPr>
           <w:b/>
           <w:bCs/>
-          <w:lang w:val="es-AR"/>
-        </w:rPr>
-      </w:pPr>
-      <w:r>
-        <w:rPr>
-          <w:lang w:val="es-AR"/>
-        </w:rPr>
-        <w:t>problemas.csv</w:t>
+          <w:sz w:val="24"/>
+          <w:szCs w:val="24"/>
+          <w:lang w:val="es-AR"/>
+        </w:rPr>
+        <w:lastRenderedPageBreak/>
+        <w:t>BASE DE DATOS</w:t>
+      </w:r>
+    </w:p>
+    <w:p>
+      <w:pPr>
+        <w:rPr>
+          <w:sz w:val="24"/>
+          <w:szCs w:val="24"/>
+          <w:lang w:val="es-AR"/>
+        </w:rPr>
+      </w:pPr>
+      <w:r>
+        <w:rPr>
+          <w:sz w:val="24"/>
+          <w:szCs w:val="24"/>
+          <w:lang w:val="es-AR"/>
+        </w:rPr>
+        <w:t>Para el almacenamiento de la información se utilizarán archivos CSV, los cuales permitirán mantener una estructura simple y fácil de administrar.</w:t>
       </w:r>
     </w:p>
     <w:p>
@@ -600,215 +586,12 @@
         <w:rPr>
           <w:b/>
           <w:bCs/>
-          <w:lang w:val="es-AR"/>
-        </w:rPr>
-      </w:pPr>
-      <w:r>
-        <w:rPr>
-          <w:lang w:val="es-AR"/>
-        </w:rPr>
-        <w:t>tickets.csv</w:t>
-      </w:r>
-    </w:p>
-    <w:p>
-      <w:pPr>
-        <w:pStyle w:val="Ttulo1"/>
-        <w:rPr>
-          <w:lang w:val="es-AR"/>
-        </w:rPr>
-      </w:pPr>
-      <w:r>
-        <w:rPr>
-          <w:lang w:val="es-AR"/>
-        </w:rPr>
-        <w:t>MÁQUINA DE ESTADOS</w:t>
-      </w:r>
-    </w:p>
-    <w:p>
-      <w:pPr>
-        <w:rPr>
-          <w:lang w:val="es-AR"/>
-        </w:rPr>
-      </w:pPr>
-      <w:r>
-        <w:rPr>
-          <w:lang w:val="es-AR"/>
-        </w:rPr>
-        <w:t xml:space="preserve">El sistema de gestión de incidencias implementa una máquina de estados finita (FSM), donde cada </w:t>
-      </w:r>
-      <w:proofErr w:type="gramStart"/>
-      <w:r>
-        <w:rPr>
-          <w:lang w:val="es-AR"/>
-        </w:rPr>
-        <w:t>ticket</w:t>
-      </w:r>
-      <w:proofErr w:type="gramEnd"/>
-      <w:r>
-        <w:rPr>
-          <w:lang w:val="es-AR"/>
-        </w:rPr>
-        <w:t xml:space="preserve"> evoluciona a través de diferentes estados según las acciones del sistema y la interacción del usuario.</w:t>
-      </w:r>
-    </w:p>
-    <w:p>
-      <w:pPr>
-        <w:rPr>
-          <w:lang w:val="es-AR"/>
-        </w:rPr>
-      </w:pPr>
-      <w:r>
-        <w:rPr>
-          <w:lang w:val="es-AR"/>
-        </w:rPr>
-        <w:t>Los estados definidos son:</w:t>
-      </w:r>
-    </w:p>
-    <w:p>
-      <w:pPr>
-        <w:rPr>
-          <w:lang w:val="es-AR"/>
-        </w:rPr>
-      </w:pPr>
-      <w:r>
-        <w:rPr>
-          <w:lang w:val="es-AR"/>
-        </w:rPr>
-        <w:t xml:space="preserve">ABIERTO: </w:t>
-      </w:r>
-      <w:proofErr w:type="gramStart"/>
-      <w:r>
-        <w:rPr>
-          <w:lang w:val="es-AR"/>
-        </w:rPr>
-        <w:t>ticket</w:t>
-      </w:r>
-      <w:proofErr w:type="gramEnd"/>
-      <w:r>
-        <w:rPr>
-          <w:lang w:val="es-AR"/>
-        </w:rPr>
-        <w:t xml:space="preserve"> creado por el </w:t>
-      </w:r>
-      <w:proofErr w:type="spellStart"/>
-      <w:r>
-        <w:rPr>
-          <w:lang w:val="es-AR"/>
-        </w:rPr>
-        <w:t>chatbot</w:t>
-      </w:r>
-      <w:proofErr w:type="spellEnd"/>
-      <w:r>
-        <w:rPr>
-          <w:lang w:val="es-AR"/>
-        </w:rPr>
-        <w:t xml:space="preserve">. </w:t>
-      </w:r>
-    </w:p>
-    <w:p>
-      <w:pPr>
-        <w:rPr>
-          <w:lang w:val="es-AR"/>
-        </w:rPr>
-      </w:pPr>
-      <w:r>
-        <w:rPr>
-          <w:lang w:val="es-AR"/>
-        </w:rPr>
-        <w:t xml:space="preserve">EN ANÁLISIS: búsqueda de coincidencias en la base de conocimiento. </w:t>
-      </w:r>
-    </w:p>
-    <w:p>
-      <w:pPr>
-        <w:rPr>
-          <w:lang w:val="es-AR"/>
-        </w:rPr>
-      </w:pPr>
-      <w:r>
-        <w:rPr>
-          <w:lang w:val="es-AR"/>
-        </w:rPr>
-        <w:t xml:space="preserve">SOLUCIÓN ENCONTRADA: se detecta una respuesta posible. </w:t>
-      </w:r>
-    </w:p>
-    <w:p>
-      <w:pPr>
-        <w:rPr>
-          <w:lang w:val="es-AR"/>
-        </w:rPr>
-      </w:pPr>
-      <w:r>
-        <w:rPr>
-          <w:lang w:val="es-AR"/>
-        </w:rPr>
-        <w:t xml:space="preserve">EN VALIDACIÓN: el usuario evalúa la solución propuesta. </w:t>
-      </w:r>
-    </w:p>
-    <w:p>
-      <w:pPr>
-        <w:rPr>
-          <w:lang w:val="es-AR"/>
-        </w:rPr>
-      </w:pPr>
-      <w:r>
-        <w:rPr>
-          <w:lang w:val="es-AR"/>
-        </w:rPr>
-        <w:t xml:space="preserve">RESUELTO: el incidente fue solucionado correctamente. </w:t>
-      </w:r>
-    </w:p>
-    <w:p>
-      <w:pPr>
-        <w:rPr>
-          <w:lang w:val="es-AR"/>
-        </w:rPr>
-      </w:pPr>
-      <w:r>
-        <w:rPr>
-          <w:lang w:val="es-AR"/>
-        </w:rPr>
-        <w:t xml:space="preserve">DERIVADO A NIVEL 2: escalamiento a soporte especializado. </w:t>
-      </w:r>
-    </w:p>
-    <w:p>
-      <w:pPr>
-        <w:rPr>
-          <w:lang w:val="es-AR"/>
-        </w:rPr>
-      </w:pPr>
-      <w:r>
-        <w:rPr>
-          <w:lang w:val="es-AR"/>
-        </w:rPr>
-        <w:t xml:space="preserve">CERRADO: finalización del ciclo de vida del </w:t>
-      </w:r>
-      <w:proofErr w:type="gramStart"/>
-      <w:r>
-        <w:rPr>
-          <w:lang w:val="es-AR"/>
-        </w:rPr>
-        <w:t>ticket</w:t>
-      </w:r>
-      <w:proofErr w:type="gramEnd"/>
-      <w:r>
-        <w:rPr>
-          <w:lang w:val="es-AR"/>
-        </w:rPr>
-        <w:t>.</w:t>
-      </w:r>
-    </w:p>
-    <w:p>
-      <w:pPr>
-        <w:rPr>
-          <w:rFonts w:cs="Times New Roman"/>
-          <w:sz w:val="24"/>
-          <w:szCs w:val="24"/>
-          <w:lang w:val="es-AR"/>
-        </w:rPr>
-      </w:pPr>
-    </w:p>
-    <w:p>
-      <w:pPr>
+          <w:sz w:val="24"/>
+          <w:szCs w:val="24"/>
+          <w:lang w:val="es-AR"/>
+        </w:rPr>
+      </w:pPr>
+      <w:r>
         <w:rPr>
           <w:b/>
           <w:bCs/>
@@ -816,8 +599,28 @@
           <w:szCs w:val="24"/>
           <w:lang w:val="es-AR"/>
         </w:rPr>
-      </w:pPr>
-      <w:r>
+        <w:t>usuarios.csv</w:t>
+      </w:r>
+    </w:p>
+    <w:p>
+      <w:pPr>
+        <w:rPr>
+          <w:sz w:val="24"/>
+          <w:szCs w:val="24"/>
+          <w:lang w:val="es-AR"/>
+        </w:rPr>
+      </w:pPr>
+      <w:r>
+        <w:rPr>
+          <w:sz w:val="24"/>
+          <w:szCs w:val="24"/>
+          <w:lang w:val="es-AR"/>
+        </w:rPr>
+        <w:t>Almacena la información de los usuarios que realizan consultas al sistema.</w:t>
+      </w:r>
+    </w:p>
+    <w:p>
+      <w:pPr>
         <w:rPr>
           <w:b/>
           <w:bCs/>
@@ -825,7 +628,16 @@
           <w:szCs w:val="24"/>
           <w:lang w:val="es-AR"/>
         </w:rPr>
-        <w:t>PRUEBAS</w:t>
+      </w:pPr>
+      <w:r>
+        <w:rPr>
+          <w:b/>
+          <w:bCs/>
+          <w:sz w:val="24"/>
+          <w:szCs w:val="24"/>
+          <w:lang w:val="es-AR"/>
+        </w:rPr>
+        <w:t>Campos:</w:t>
       </w:r>
     </w:p>
     <w:p>
@@ -833,23 +645,21 @@
         <w:pStyle w:val="Prrafodelista"/>
         <w:numPr>
           <w:ilvl w:val="0"/>
-          <w:numId w:val="1"/>
+          <w:numId w:val="3"/>
         </w:numPr>
         <w:rPr>
-          <w:b/>
-          <w:bCs/>
-          <w:sz w:val="24"/>
-          <w:szCs w:val="24"/>
-          <w:lang w:val="es-AR"/>
-        </w:rPr>
-      </w:pPr>
-      <w:r>
-        <w:rPr>
-          <w:sz w:val="24"/>
-          <w:szCs w:val="24"/>
-          <w:lang w:val="es-AR"/>
-        </w:rPr>
-        <w:t>Problema encontrado y resuelto</w:t>
+          <w:sz w:val="24"/>
+          <w:szCs w:val="24"/>
+          <w:lang w:val="es-AR"/>
+        </w:rPr>
+      </w:pPr>
+      <w:r>
+        <w:rPr>
+          <w:sz w:val="24"/>
+          <w:szCs w:val="24"/>
+          <w:lang w:val="es-AR"/>
+        </w:rPr>
+        <w:t>id</w:t>
       </w:r>
     </w:p>
     <w:p>
@@ -857,8 +667,25 @@
         <w:pStyle w:val="Prrafodelista"/>
         <w:numPr>
           <w:ilvl w:val="0"/>
-          <w:numId w:val="1"/>
+          <w:numId w:val="3"/>
         </w:numPr>
+        <w:rPr>
+          <w:sz w:val="24"/>
+          <w:szCs w:val="24"/>
+          <w:lang w:val="es-AR"/>
+        </w:rPr>
+      </w:pPr>
+      <w:r>
+        <w:rPr>
+          <w:sz w:val="24"/>
+          <w:szCs w:val="24"/>
+          <w:lang w:val="es-AR"/>
+        </w:rPr>
+        <w:t>nombre</w:t>
+      </w:r>
+    </w:p>
+    <w:p>
+      <w:pPr>
         <w:rPr>
           <w:b/>
           <w:bCs/>
@@ -869,29 +696,69 @@
       </w:pPr>
       <w:r>
         <w:rPr>
-          <w:sz w:val="24"/>
-          <w:szCs w:val="24"/>
-          <w:lang w:val="es-AR"/>
-        </w:rPr>
-        <w:t xml:space="preserve">Problema </w:t>
-      </w:r>
-      <w:proofErr w:type="gramStart"/>
-      <w:r>
-        <w:rPr>
-          <w:sz w:val="24"/>
-          <w:szCs w:val="24"/>
-          <w:lang w:val="es-AR"/>
-        </w:rPr>
-        <w:t>encontrado</w:t>
-      </w:r>
-      <w:proofErr w:type="gramEnd"/>
-      <w:r>
-        <w:rPr>
-          <w:sz w:val="24"/>
-          <w:szCs w:val="24"/>
-          <w:lang w:val="es-AR"/>
-        </w:rPr>
-        <w:t xml:space="preserve"> pero no resuelto</w:t>
+          <w:b/>
+          <w:bCs/>
+          <w:sz w:val="24"/>
+          <w:szCs w:val="24"/>
+          <w:lang w:val="es-AR"/>
+        </w:rPr>
+        <w:t>problemas.csv</w:t>
+      </w:r>
+    </w:p>
+    <w:p>
+      <w:pPr>
+        <w:rPr>
+          <w:sz w:val="24"/>
+          <w:szCs w:val="24"/>
+          <w:lang w:val="es-AR"/>
+        </w:rPr>
+      </w:pPr>
+      <w:r>
+        <w:rPr>
+          <w:sz w:val="24"/>
+          <w:szCs w:val="24"/>
+          <w:lang w:val="es-AR"/>
+        </w:rPr>
+        <w:t xml:space="preserve">Contiene la base de conocimientos del </w:t>
+      </w:r>
+      <w:proofErr w:type="spellStart"/>
+      <w:r>
+        <w:rPr>
+          <w:sz w:val="24"/>
+          <w:szCs w:val="24"/>
+          <w:lang w:val="es-AR"/>
+        </w:rPr>
+        <w:t>chatbot</w:t>
+      </w:r>
+      <w:proofErr w:type="spellEnd"/>
+      <w:r>
+        <w:rPr>
+          <w:sz w:val="24"/>
+          <w:szCs w:val="24"/>
+          <w:lang w:val="es-AR"/>
+        </w:rPr>
+        <w:t>, relacionando los problemas más frecuentes con sus respectivas soluciones.</w:t>
+      </w:r>
+    </w:p>
+    <w:p>
+      <w:pPr>
+        <w:rPr>
+          <w:b/>
+          <w:bCs/>
+          <w:sz w:val="24"/>
+          <w:szCs w:val="24"/>
+          <w:lang w:val="es-AR"/>
+        </w:rPr>
+      </w:pPr>
+      <w:r>
+        <w:rPr>
+          <w:b/>
+          <w:bCs/>
+          <w:sz w:val="24"/>
+          <w:szCs w:val="24"/>
+          <w:lang w:val="es-AR"/>
+        </w:rPr>
+        <w:t>Campos:</w:t>
       </w:r>
     </w:p>
     <w:p>
@@ -899,23 +766,21 @@
         <w:pStyle w:val="Prrafodelista"/>
         <w:numPr>
           <w:ilvl w:val="0"/>
-          <w:numId w:val="1"/>
+          <w:numId w:val="3"/>
         </w:numPr>
         <w:rPr>
-          <w:b/>
-          <w:bCs/>
-          <w:sz w:val="24"/>
-          <w:szCs w:val="24"/>
-          <w:lang w:val="es-AR"/>
-        </w:rPr>
-      </w:pPr>
-      <w:r>
-        <w:rPr>
-          <w:sz w:val="24"/>
-          <w:szCs w:val="24"/>
-          <w:lang w:val="es-AR"/>
-        </w:rPr>
-        <w:t>Problema no registrado</w:t>
+          <w:sz w:val="24"/>
+          <w:szCs w:val="24"/>
+          <w:lang w:val="es-AR"/>
+        </w:rPr>
+      </w:pPr>
+      <w:r>
+        <w:rPr>
+          <w:sz w:val="24"/>
+          <w:szCs w:val="24"/>
+          <w:lang w:val="es-AR"/>
+        </w:rPr>
+        <w:t>problema</w:t>
       </w:r>
     </w:p>
     <w:p>
@@ -923,8 +788,168 @@
         <w:pStyle w:val="Prrafodelista"/>
         <w:numPr>
           <w:ilvl w:val="0"/>
-          <w:numId w:val="1"/>
+          <w:numId w:val="3"/>
         </w:numPr>
+        <w:rPr>
+          <w:sz w:val="24"/>
+          <w:szCs w:val="24"/>
+          <w:lang w:val="es-AR"/>
+        </w:rPr>
+      </w:pPr>
+      <w:proofErr w:type="spellStart"/>
+      <w:r>
+        <w:rPr>
+          <w:sz w:val="24"/>
+          <w:szCs w:val="24"/>
+          <w:lang w:val="es-AR"/>
+        </w:rPr>
+        <w:t>solucion</w:t>
+      </w:r>
+      <w:proofErr w:type="spellEnd"/>
+    </w:p>
+    <w:p>
+      <w:pPr>
+        <w:rPr>
+          <w:sz w:val="24"/>
+          <w:szCs w:val="24"/>
+          <w:lang w:val="es-AR"/>
+        </w:rPr>
+      </w:pPr>
+      <w:r>
+        <w:rPr>
+          <w:sz w:val="24"/>
+          <w:szCs w:val="24"/>
+          <w:lang w:val="es-AR"/>
+        </w:rPr>
+        <w:t>Ejemplos:</w:t>
+      </w:r>
+    </w:p>
+    <w:p>
+      <w:pPr>
+        <w:pStyle w:val="Prrafodelista"/>
+        <w:numPr>
+          <w:ilvl w:val="0"/>
+          <w:numId w:val="3"/>
+        </w:numPr>
+        <w:rPr>
+          <w:sz w:val="24"/>
+          <w:szCs w:val="24"/>
+          <w:lang w:val="es-AR"/>
+        </w:rPr>
+      </w:pPr>
+      <w:r>
+        <w:rPr>
+          <w:sz w:val="24"/>
+          <w:szCs w:val="24"/>
+          <w:lang w:val="es-AR"/>
+        </w:rPr>
+        <w:t xml:space="preserve">Internet lento </w:t>
+      </w:r>
+      <w:r>
+        <w:rPr>
+          <w:sz w:val="24"/>
+          <w:szCs w:val="24"/>
+          <w:lang w:val="es-AR"/>
+        </w:rPr>
+        <w:sym w:font="Wingdings" w:char="F0E0"/>
+      </w:r>
+      <w:r>
+        <w:rPr>
+          <w:sz w:val="24"/>
+          <w:szCs w:val="24"/>
+          <w:lang w:val="es-AR"/>
+        </w:rPr>
+        <w:t xml:space="preserve"> Reiniciar </w:t>
+      </w:r>
+      <w:proofErr w:type="spellStart"/>
+      <w:r>
+        <w:rPr>
+          <w:sz w:val="24"/>
+          <w:szCs w:val="24"/>
+          <w:lang w:val="es-AR"/>
+        </w:rPr>
+        <w:t>Router</w:t>
+      </w:r>
+      <w:proofErr w:type="spellEnd"/>
+    </w:p>
+    <w:p>
+      <w:pPr>
+        <w:pStyle w:val="Prrafodelista"/>
+        <w:numPr>
+          <w:ilvl w:val="0"/>
+          <w:numId w:val="3"/>
+        </w:numPr>
+        <w:rPr>
+          <w:sz w:val="24"/>
+          <w:szCs w:val="24"/>
+          <w:lang w:val="es-AR"/>
+        </w:rPr>
+      </w:pPr>
+      <w:r>
+        <w:rPr>
+          <w:sz w:val="24"/>
+          <w:szCs w:val="24"/>
+          <w:lang w:val="es-AR"/>
+        </w:rPr>
+        <w:t xml:space="preserve">Impresora no imprime </w:t>
+      </w:r>
+      <w:r>
+        <w:rPr>
+          <w:sz w:val="24"/>
+          <w:szCs w:val="24"/>
+          <w:lang w:val="es-AR"/>
+        </w:rPr>
+        <w:sym w:font="Wingdings" w:char="F0E0"/>
+      </w:r>
+      <w:r>
+        <w:rPr>
+          <w:sz w:val="24"/>
+          <w:szCs w:val="24"/>
+          <w:lang w:val="es-AR"/>
+        </w:rPr>
+        <w:t xml:space="preserve"> Reiniciar servicio de impresión</w:t>
+      </w:r>
+    </w:p>
+    <w:p>
+      <w:pPr>
+        <w:pStyle w:val="Prrafodelista"/>
+        <w:numPr>
+          <w:ilvl w:val="0"/>
+          <w:numId w:val="3"/>
+        </w:numPr>
+        <w:rPr>
+          <w:sz w:val="24"/>
+          <w:szCs w:val="24"/>
+          <w:lang w:val="es-AR"/>
+        </w:rPr>
+      </w:pPr>
+      <w:r>
+        <w:rPr>
+          <w:sz w:val="24"/>
+          <w:szCs w:val="24"/>
+          <w:lang w:val="es-AR"/>
+        </w:rPr>
+        <w:t xml:space="preserve">PC sin sonido </w:t>
+      </w:r>
+      <w:r>
+        <w:rPr>
+          <w:sz w:val="24"/>
+          <w:szCs w:val="24"/>
+          <w:lang w:val="es-AR"/>
+        </w:rPr>
+        <w:sym w:font="Wingdings" w:char="F0E0"/>
+      </w:r>
+      <w:r>
+        <w:rPr>
+          <w:sz w:val="24"/>
+          <w:szCs w:val="24"/>
+          <w:lang w:val="es-AR"/>
+        </w:rPr>
+        <w:t xml:space="preserve"> Verificar el dispositivo predeterminado</w:t>
+      </w:r>
+    </w:p>
+    <w:p>
+      <w:pPr>
         <w:rPr>
           <w:b/>
           <w:bCs/>
@@ -935,24 +960,34 @@
       </w:pPr>
       <w:r>
         <w:rPr>
-          <w:sz w:val="24"/>
-          <w:szCs w:val="24"/>
-          <w:lang w:val="es-AR"/>
-        </w:rPr>
-        <w:t>Datos incorrectos</w:t>
-      </w:r>
-    </w:p>
-    <w:p>
-      <w:pPr>
-        <w:rPr>
           <w:b/>
           <w:bCs/>
           <w:sz w:val="24"/>
           <w:szCs w:val="24"/>
           <w:lang w:val="es-AR"/>
         </w:rPr>
-      </w:pPr>
-      <w:r>
+        <w:t>tickets.csv</w:t>
+      </w:r>
+    </w:p>
+    <w:p>
+      <w:pPr>
+        <w:rPr>
+          <w:sz w:val="24"/>
+          <w:szCs w:val="24"/>
+          <w:lang w:val="es-AR"/>
+        </w:rPr>
+      </w:pPr>
+      <w:r>
+        <w:rPr>
+          <w:sz w:val="24"/>
+          <w:szCs w:val="24"/>
+          <w:lang w:val="es-AR"/>
+        </w:rPr>
+        <w:t>Registra las incidencias generadas por los usuarios y el estado final de cada una.</w:t>
+      </w:r>
+    </w:p>
+    <w:p>
+      <w:pPr>
         <w:rPr>
           <w:b/>
           <w:bCs/>
@@ -960,28 +995,8 @@
           <w:szCs w:val="24"/>
           <w:lang w:val="es-AR"/>
         </w:rPr>
-        <w:t>MANUAL DE USUARIO</w:t>
-      </w:r>
-    </w:p>
-    <w:p>
-      <w:pPr>
-        <w:rPr>
-          <w:sz w:val="24"/>
-          <w:szCs w:val="24"/>
-          <w:lang w:val="es-AR"/>
-        </w:rPr>
-      </w:pPr>
-      <w:r>
-        <w:rPr>
-          <w:sz w:val="24"/>
-          <w:szCs w:val="24"/>
-          <w:lang w:val="es-AR"/>
-        </w:rPr>
-        <w:t>Funcionamiento del sistema</w:t>
-      </w:r>
-    </w:p>
-    <w:p>
-      <w:pPr>
+      </w:pPr>
+      <w:r>
         <w:rPr>
           <w:b/>
           <w:bCs/>
@@ -989,6 +1004,117 @@
           <w:szCs w:val="24"/>
           <w:lang w:val="es-AR"/>
         </w:rPr>
+        <w:t>Campos:</w:t>
+      </w:r>
+    </w:p>
+    <w:p>
+      <w:pPr>
+        <w:pStyle w:val="Prrafodelista"/>
+        <w:numPr>
+          <w:ilvl w:val="0"/>
+          <w:numId w:val="3"/>
+        </w:numPr>
+        <w:rPr>
+          <w:sz w:val="24"/>
+          <w:szCs w:val="24"/>
+          <w:lang w:val="es-AR"/>
+        </w:rPr>
+      </w:pPr>
+      <w:proofErr w:type="spellStart"/>
+      <w:r>
+        <w:rPr>
+          <w:sz w:val="24"/>
+          <w:szCs w:val="24"/>
+          <w:lang w:val="es-AR"/>
+        </w:rPr>
+        <w:t>id_ticket</w:t>
+      </w:r>
+      <w:proofErr w:type="spellEnd"/>
+    </w:p>
+    <w:p>
+      <w:pPr>
+        <w:pStyle w:val="Prrafodelista"/>
+        <w:numPr>
+          <w:ilvl w:val="0"/>
+          <w:numId w:val="3"/>
+        </w:numPr>
+        <w:rPr>
+          <w:sz w:val="24"/>
+          <w:szCs w:val="24"/>
+          <w:lang w:val="es-AR"/>
+        </w:rPr>
+      </w:pPr>
+      <w:proofErr w:type="spellStart"/>
+      <w:r>
+        <w:rPr>
+          <w:sz w:val="24"/>
+          <w:szCs w:val="24"/>
+          <w:lang w:val="es-AR"/>
+        </w:rPr>
+        <w:t>nombre_usuario</w:t>
+      </w:r>
+      <w:proofErr w:type="spellEnd"/>
+    </w:p>
+    <w:p>
+      <w:pPr>
+        <w:pStyle w:val="Prrafodelista"/>
+        <w:numPr>
+          <w:ilvl w:val="0"/>
+          <w:numId w:val="3"/>
+        </w:numPr>
+        <w:rPr>
+          <w:sz w:val="24"/>
+          <w:szCs w:val="24"/>
+          <w:lang w:val="es-AR"/>
+        </w:rPr>
+      </w:pPr>
+      <w:r>
+        <w:rPr>
+          <w:sz w:val="24"/>
+          <w:szCs w:val="24"/>
+          <w:lang w:val="es-AR"/>
+        </w:rPr>
+        <w:t>problema</w:t>
+      </w:r>
+    </w:p>
+    <w:p>
+      <w:pPr>
+        <w:pStyle w:val="Prrafodelista"/>
+        <w:numPr>
+          <w:ilvl w:val="0"/>
+          <w:numId w:val="3"/>
+        </w:numPr>
+        <w:rPr>
+          <w:sz w:val="24"/>
+          <w:szCs w:val="24"/>
+          <w:lang w:val="es-AR"/>
+        </w:rPr>
+      </w:pPr>
+      <w:r>
+        <w:rPr>
+          <w:sz w:val="24"/>
+          <w:szCs w:val="24"/>
+          <w:lang w:val="es-AR"/>
+        </w:rPr>
+        <w:t>estado</w:t>
+      </w:r>
+    </w:p>
+    <w:p>
+      <w:pPr>
+        <w:rPr>
+          <w:sz w:val="24"/>
+          <w:szCs w:val="24"/>
+          <w:lang w:val="es-AR"/>
+        </w:rPr>
+      </w:pPr>
+    </w:p>
+    <w:p>
+      <w:pPr>
+        <w:rPr>
+          <w:sz w:val="24"/>
+          <w:szCs w:val="24"/>
+          <w:lang w:val="es-AR"/>
+        </w:rPr>
       </w:pPr>
       <w:r>
         <w:rPr>
@@ -998,17 +1124,499 @@
           <w:szCs w:val="24"/>
           <w:lang w:val="es-AR"/>
         </w:rPr>
+        <w:t>MÁQUINA DE ESTADOS</w:t>
+      </w:r>
+    </w:p>
+    <w:p>
+      <w:pPr>
+        <w:rPr>
+          <w:lang w:val="es-AR"/>
+        </w:rPr>
+      </w:pPr>
+      <w:r>
+        <w:rPr>
+          <w:lang w:val="es-AR"/>
+        </w:rPr>
+        <w:t>El sistema implementa una Máquina de Estados Finitos (FSM), donde cada ticket atraviesa distintas etapas según las acciones realizadas y las respuestas proporcionadas por el usuario.</w:t>
+      </w:r>
+      <w:r>
+        <w:rPr>
+          <w:lang w:val="es-AR"/>
+        </w:rPr>
+        <w:t xml:space="preserve"> </w:t>
+      </w:r>
+    </w:p>
+    <w:p>
+      <w:pPr>
+        <w:rPr>
+          <w:lang w:val="es-AR"/>
+        </w:rPr>
+      </w:pPr>
+      <w:r>
+        <w:rPr>
+          <w:lang w:val="es-AR"/>
+        </w:rPr>
+        <w:t>Los estados definidos son:</w:t>
+      </w:r>
+    </w:p>
+    <w:p>
+      <w:pPr>
+        <w:rPr>
+          <w:lang w:val="es-AR"/>
+        </w:rPr>
+      </w:pPr>
+      <w:r>
+        <w:rPr>
+          <w:lang w:val="es-AR"/>
+        </w:rPr>
+        <w:t xml:space="preserve">ABIERTO: </w:t>
+      </w:r>
+      <w:r>
+        <w:t>Representa la creación inicial del ticket y la recepción del problema reportado.</w:t>
+      </w:r>
+    </w:p>
+    <w:p>
+      <w:r>
+        <w:rPr>
+          <w:lang w:val="es-AR"/>
+        </w:rPr>
+        <w:t xml:space="preserve">EN ANÁLISIS: </w:t>
+      </w:r>
+      <w:r>
+        <w:t>El sistema consulta la base de conocimientos en busca de una solución asociada al inconveniente.</w:t>
+      </w:r>
+    </w:p>
+    <w:p>
+      <w:pPr>
+        <w:rPr>
+          <w:lang w:val="es-AR"/>
+        </w:rPr>
+      </w:pPr>
+      <w:r>
+        <w:rPr>
+          <w:lang w:val="es-AR"/>
+        </w:rPr>
+        <w:t xml:space="preserve">SOLUCIÓN ENCONTRADA: </w:t>
+      </w:r>
+      <w:r>
+        <w:t>Se encontró una posible solución y esta es mostrada al usuario.</w:t>
+      </w:r>
+    </w:p>
+    <w:p>
+      <w:pPr>
+        <w:rPr>
+          <w:lang w:val="es-AR"/>
+        </w:rPr>
+      </w:pPr>
+      <w:r>
+        <w:rPr>
+          <w:lang w:val="es-AR"/>
+        </w:rPr>
+        <w:lastRenderedPageBreak/>
+        <w:t>RESUELTO</w:t>
+      </w:r>
+      <w:r>
+        <w:rPr>
+          <w:lang w:val="es-AR"/>
+        </w:rPr>
+        <w:t xml:space="preserve">: </w:t>
+      </w:r>
+      <w:r>
+        <w:t>El usuario confirma que la solución proporcionada resolvió el inconveniente.</w:t>
+      </w:r>
+    </w:p>
+    <w:p>
+      <w:pPr>
+        <w:rPr>
+          <w:lang w:val="es-AR"/>
+        </w:rPr>
+      </w:pPr>
+      <w:r>
+        <w:rPr>
+          <w:lang w:val="es-AR"/>
+        </w:rPr>
+        <w:t xml:space="preserve">DERIVADO A NIVEL 2: </w:t>
+      </w:r>
+      <w:r>
+        <w:t>No se encontró una solución o la respuesta ofrecida no resolvió el problema, por lo que el caso es escalado al soporte especializado.</w:t>
+      </w:r>
+    </w:p>
+    <w:p>
+      <w:pPr>
+        <w:rPr>
+          <w:lang w:val="es-AR"/>
+        </w:rPr>
+      </w:pPr>
+      <w:r>
+        <w:rPr>
+          <w:lang w:val="es-AR"/>
+        </w:rPr>
+        <w:t>CERRADO: finalización del ciclo de vida del ticket.</w:t>
+      </w:r>
+    </w:p>
+    <w:p>
+      <w:pPr>
+        <w:rPr>
+          <w:rFonts w:cs="Times New Roman"/>
+          <w:lang w:val="es-AR"/>
+        </w:rPr>
+      </w:pPr>
+      <w:r>
+        <w:rPr>
+          <w:rFonts w:cs="Times New Roman"/>
+        </w:rPr>
+        <w:t>El uso de una máquina de estados permite representar de forma clara la lógica del proceso modelado mediante BPMN y facilita el control de las distintas situaciones que pueden presentarse durante la atención de incidencias.</w:t>
+      </w:r>
+    </w:p>
+    <w:p>
+      <w:pPr>
+        <w:rPr>
+          <w:b/>
+          <w:bCs/>
+          <w:sz w:val="24"/>
+          <w:szCs w:val="24"/>
+          <w:lang w:val="es-AR"/>
+        </w:rPr>
+      </w:pPr>
+      <w:r>
+        <w:rPr>
+          <w:b/>
+          <w:bCs/>
+          <w:sz w:val="24"/>
+          <w:szCs w:val="24"/>
+          <w:lang w:val="es-AR"/>
+        </w:rPr>
+        <w:t>PRUEBAS</w:t>
+      </w:r>
+    </w:p>
+    <w:p>
+      <w:r>
+        <w:t>Para verificar el correcto funcionamiento del sistema se consideraron diferentes escenarios:</w:t>
+      </w:r>
+    </w:p>
+    <w:p>
+      <w:pPr>
+        <w:pStyle w:val="Prrafodelista"/>
+        <w:numPr>
+          <w:ilvl w:val="0"/>
+          <w:numId w:val="3"/>
+        </w:numPr>
+      </w:pPr>
+      <w:r>
+        <w:rPr>
+          <w:b/>
+          <w:bCs/>
+        </w:rPr>
+        <w:t>Problema encontrado y resuelto:</w:t>
+      </w:r>
+      <w:r>
+        <w:br/>
+        <w:t>El sistema localiza una solución en la base de conocimientos y el usuario confirma que esta resolvió el inconveniente. El ticket se cierra correctamente.</w:t>
+      </w:r>
+    </w:p>
+    <w:p>
+      <w:pPr>
+        <w:pStyle w:val="Prrafodelista"/>
+        <w:numPr>
+          <w:ilvl w:val="0"/>
+          <w:numId w:val="3"/>
+        </w:numPr>
+      </w:pPr>
+      <w:r>
+        <w:rPr>
+          <w:b/>
+          <w:bCs/>
+        </w:rPr>
+        <w:t xml:space="preserve">Problema </w:t>
+      </w:r>
+      <w:r>
+        <w:rPr>
+          <w:b/>
+          <w:bCs/>
+        </w:rPr>
+        <w:t>encontrado,</w:t>
+      </w:r>
+      <w:r>
+        <w:rPr>
+          <w:b/>
+          <w:bCs/>
+        </w:rPr>
+        <w:t xml:space="preserve"> pero no resuelto:</w:t>
+      </w:r>
+      <w:r>
+        <w:br/>
+        <w:t>El sistema propone una solución, pero el usuario indica que esta no solucionó el problema. El ticket es derivado al soporte de Nivel 2.</w:t>
+      </w:r>
+    </w:p>
+    <w:p>
+      <w:pPr>
+        <w:pStyle w:val="Prrafodelista"/>
+        <w:numPr>
+          <w:ilvl w:val="0"/>
+          <w:numId w:val="3"/>
+        </w:numPr>
+      </w:pPr>
+      <w:r>
+        <w:rPr>
+          <w:b/>
+          <w:bCs/>
+        </w:rPr>
+        <w:t>Problema no registrado:</w:t>
+      </w:r>
+      <w:r>
+        <w:br/>
+        <w:t>El problema informado por el usuario no se encuentra en la base de conocimientos, por lo que el sistema deriva automáticamente el caso al soporte especializado.</w:t>
+      </w:r>
+    </w:p>
+    <w:p>
+      <w:pPr>
+        <w:pStyle w:val="Prrafodelista"/>
+        <w:numPr>
+          <w:ilvl w:val="0"/>
+          <w:numId w:val="3"/>
+        </w:numPr>
+      </w:pPr>
+      <w:r>
+        <w:rPr>
+          <w:b/>
+          <w:bCs/>
+        </w:rPr>
+        <w:t>Datos incorrectos:</w:t>
+      </w:r>
+      <w:r>
+        <w:br/>
+        <w:t>Se contemplan respuestas inválidas o campos vacíos, solicitando nuevamente la información correspondiente para continuar con el proceso.</w:t>
+      </w:r>
+    </w:p>
+    <w:p>
+      <w:pPr>
+        <w:rPr>
+          <w:sz w:val="24"/>
+          <w:szCs w:val="24"/>
+        </w:rPr>
+      </w:pPr>
+    </w:p>
+    <w:p>
+      <w:pPr>
+        <w:rPr>
+          <w:b/>
+          <w:bCs/>
+          <w:sz w:val="24"/>
+          <w:szCs w:val="24"/>
+          <w:lang w:val="es-AR"/>
+        </w:rPr>
+      </w:pPr>
+      <w:r>
+        <w:rPr>
+          <w:b/>
+          <w:bCs/>
+          <w:sz w:val="24"/>
+          <w:szCs w:val="24"/>
+          <w:lang w:val="es-AR"/>
+        </w:rPr>
+        <w:t>MANUAL DE USUARIO</w:t>
+      </w:r>
+    </w:p>
+    <w:p>
+      <w:pPr>
+        <w:rPr>
+          <w:lang w:val="es-AR"/>
+        </w:rPr>
+      </w:pPr>
+      <w:r>
+        <w:rPr>
+          <w:lang w:val="es-AR"/>
+        </w:rPr>
+        <w:t>Funcionamiento del sistema</w:t>
+      </w:r>
+    </w:p>
+    <w:p>
+      <w:pPr>
+        <w:pStyle w:val="Prrafodelista"/>
+        <w:numPr>
+          <w:ilvl w:val="0"/>
+          <w:numId w:val="4"/>
+        </w:numPr>
+        <w:rPr>
+          <w:lang w:val="es-AR"/>
+        </w:rPr>
+      </w:pPr>
+      <w:r>
+        <w:rPr>
+          <w:lang w:val="es-AR"/>
+        </w:rPr>
+        <w:t>El usuario inicia la ejecución del programa</w:t>
+      </w:r>
+    </w:p>
+    <w:p>
+      <w:pPr>
+        <w:pStyle w:val="Prrafodelista"/>
+        <w:numPr>
+          <w:ilvl w:val="0"/>
+          <w:numId w:val="4"/>
+        </w:numPr>
+        <w:rPr>
+          <w:lang w:val="es-AR"/>
+        </w:rPr>
+      </w:pPr>
+      <w:r>
+        <w:rPr>
+          <w:lang w:val="es-AR"/>
+        </w:rPr>
+        <w:t>Ingresa su nombre</w:t>
+      </w:r>
+    </w:p>
+    <w:p>
+      <w:pPr>
+        <w:pStyle w:val="Prrafodelista"/>
+        <w:numPr>
+          <w:ilvl w:val="0"/>
+          <w:numId w:val="4"/>
+        </w:numPr>
+        <w:rPr>
+          <w:lang w:val="es-AR"/>
+        </w:rPr>
+      </w:pPr>
+      <w:r>
+        <w:rPr>
+          <w:lang w:val="es-AR"/>
+        </w:rPr>
+        <w:t>Describe el inconveniente experimentado</w:t>
+      </w:r>
+    </w:p>
+    <w:p>
+      <w:pPr>
+        <w:pStyle w:val="Prrafodelista"/>
+        <w:numPr>
+          <w:ilvl w:val="0"/>
+          <w:numId w:val="4"/>
+        </w:numPr>
+        <w:rPr>
+          <w:lang w:val="es-AR"/>
+        </w:rPr>
+      </w:pPr>
+      <w:r>
+        <w:rPr>
+          <w:lang w:val="es-AR"/>
+        </w:rPr>
+        <w:t>El sistema analiza la información ingresada</w:t>
+      </w:r>
+    </w:p>
+    <w:p>
+      <w:pPr>
+        <w:pStyle w:val="Prrafodelista"/>
+        <w:numPr>
+          <w:ilvl w:val="0"/>
+          <w:numId w:val="4"/>
+        </w:numPr>
+        <w:rPr>
+          <w:lang w:val="es-AR"/>
+        </w:rPr>
+      </w:pPr>
+      <w:r>
+        <w:rPr>
+          <w:lang w:val="es-AR"/>
+        </w:rPr>
+        <w:t>Si existe una solución registrada, esta es mostrada al usuario</w:t>
+      </w:r>
+    </w:p>
+    <w:p>
+      <w:pPr>
+        <w:pStyle w:val="Prrafodelista"/>
+        <w:numPr>
+          <w:ilvl w:val="0"/>
+          <w:numId w:val="4"/>
+        </w:numPr>
+        <w:rPr>
+          <w:lang w:val="es-AR"/>
+        </w:rPr>
+      </w:pPr>
+      <w:r>
+        <w:rPr>
+          <w:lang w:val="es-AR"/>
+        </w:rPr>
+        <w:t>El usuario confirma si la solución funcionó</w:t>
+      </w:r>
+    </w:p>
+    <w:p>
+      <w:pPr>
+        <w:pStyle w:val="Prrafodelista"/>
+        <w:numPr>
+          <w:ilvl w:val="0"/>
+          <w:numId w:val="4"/>
+        </w:numPr>
+        <w:rPr>
+          <w:lang w:val="es-AR"/>
+        </w:rPr>
+      </w:pPr>
+      <w:r>
+        <w:rPr>
+          <w:lang w:val="es-AR"/>
+        </w:rPr>
+        <w:t>En caso de funcionar, el ticket se cierra</w:t>
+      </w:r>
+    </w:p>
+    <w:p>
+      <w:pPr>
+        <w:pStyle w:val="Prrafodelista"/>
+        <w:numPr>
+          <w:ilvl w:val="0"/>
+          <w:numId w:val="4"/>
+        </w:numPr>
+        <w:rPr>
+          <w:lang w:val="es-AR"/>
+        </w:rPr>
+      </w:pPr>
+      <w:r>
+        <w:rPr>
+          <w:lang w:val="es-AR"/>
+        </w:rPr>
+        <w:t>En caso de no funcionar, el incidente es derivado a soporte técnico de nivel 2</w:t>
+      </w:r>
+    </w:p>
+    <w:p>
+      <w:pPr>
+        <w:rPr>
+          <w:b/>
+          <w:bCs/>
+          <w:sz w:val="24"/>
+          <w:szCs w:val="24"/>
+          <w:lang w:val="es-AR"/>
+        </w:rPr>
+      </w:pPr>
+      <w:r>
+        <w:rPr>
+          <w:b/>
+          <w:bCs/>
+          <w:sz w:val="24"/>
+          <w:szCs w:val="24"/>
+          <w:lang w:val="es-AR"/>
+        </w:rPr>
         <w:t>CONCLUSIONES</w:t>
       </w:r>
     </w:p>
     <w:p>
-      <w:pPr>
-        <w:rPr>
-          <w:sz w:val="24"/>
-          <w:szCs w:val="24"/>
-          <w:lang w:val="es-AR"/>
-        </w:rPr>
-      </w:pPr>
+      <w:r>
+        <w:t xml:space="preserve">La implementación del </w:t>
+      </w:r>
+      <w:proofErr w:type="spellStart"/>
+      <w:r>
+        <w:t>chatbot</w:t>
+      </w:r>
+      <w:proofErr w:type="spellEnd"/>
+      <w:r>
+        <w:t xml:space="preserve"> de Soporte Técnico Nivel 1 permite automatizar la atención inicial de incidencias frecuentes, reduciendo los tiempos de respuesta y optimizando la utilización de los recursos del área de soporte.</w:t>
+      </w:r>
+    </w:p>
+    <w:p>
+      <w:r>
+        <w:t>Mediante la utilización de una base de conocimientos y una máquina de estados, el sistema es capaz de brindar soluciones automáticas para problemas recurrentes y derivar aquellos casos que requieren una intervención especializada.</w:t>
+      </w:r>
+    </w:p>
+    <w:p>
+      <w:r>
+        <w:t>Además, el desarrollo del proyecto permitió aplicar conceptos relacionados con modelado de procesos mediante BPMN, estructuras de datos, máquinas de estados y programación en Python, integrando conocimientos adquiridos durante la cursada.</w:t>
+      </w:r>
     </w:p>
     <w:sectPr>
       <w:pgSz w:w="11906" w:h="16838"/>
@@ -1023,6 +1631,118 @@
 <file path=word/numbering.xml><?xml version="1.0" encoding="utf-8"?>
 <w:numbering xmlns:wpc="http://schemas.microsoft.com/office/word/2010/wordprocessingCanvas" xmlns:cx="http://schemas.microsoft.com/office/drawing/2014/chartex" xmlns:cx1="http://schemas.microsoft.com/office/drawing/2015/9/8/chartex" xmlns:cx2="http://schemas.microsoft.com/office/drawing/2015/10/21/chartex" xmlns:cx3="http://schemas.microsoft.com/office/drawing/2016/5/9/chartex" xmlns:cx4="http://schemas.microsoft.com/office/drawing/2016/5/10/chartex" xmlns:cx5="http://schemas.microsoft.com/office/drawing/2016/5/11/chartex" xmlns:cx6="http://schemas.microsoft.com/office/drawing/2016/5/12/chartex" xmlns:cx7="http://schemas.microsoft.com/office/drawing/2016/5/13/chartex" xmlns:cx8="http://schemas.microsoft.com/office/drawing/2016/5/14/chartex" xmlns:mc="http://schemas.openxmlformats.org/markup-compatibility/2006" xmlns:aink="http://schemas.microsoft.com/office/drawing/2016/ink" xmlns:am3d="http://schemas.microsoft.com/office/drawing/2017/model3d" xmlns:o="urn:schemas-microsoft-com:office:office" xmlns:oel="http://schemas.microsoft.com/office/2019/extlst" xmlns:r="http://schemas.openxmlformats.org/officeDocument/2006/relationships" xmlns:m="http://schemas.openxmlformats.org/officeDocument/2006/math" xmlns:v="urn:schemas-microsoft-com:vml" xmlns:wp14="http://schemas.microsoft.com/office/word/2010/wordprocessingDrawing" xmlns:wp="http://schemas.openxmlformats.org/drawingml/2006/wordprocessingDrawing" xmlns:w10="urn:schemas-microsoft-com:office:word" xmlns:w="http://schemas.openxmlformats.org/wordprocessingml/2006/main" xmlns:w14="http://schemas.microsoft.com/office/word/2010/wordml" xmlns:w15="http://schemas.microsoft.com/office/word/2012/wordml" xmlns:w16cex="http://schemas.microsoft.com/office/word/2018/wordml/cex" xmlns:w16cid="http://schemas.microsoft.com/office/word/2016/wordml/cid" xmlns:w16="http://schemas.microsoft.com/office/word/2018/wordml" xmlns:w16du="http://schemas.microsoft.com/office/word/2023/wordml/word16du" xmlns:w16sdtdh="http://schemas.microsoft.com/office/word/2020/wordml/sdtdatahash" xmlns:w16sdtfl="http://schemas.microsoft.com/office/word/2024/wordml/sdtformatlock" xmlns:w16se="http://schemas.microsoft.com/office/word/2015/wordml/symex" xmlns:wpg="http://schemas.microsoft.com/office/word/2010/wordprocessingGroup" xmlns:wpi="http://schemas.microsoft.com/office/word/2010/wordprocessingInk" xmlns:wne="http://schemas.microsoft.com/office/word/2006/wordml" xmlns:wps="http://schemas.microsoft.com/office/word/2010/wordprocessingShape" mc:Ignorable="w14 w15 w16se w16cid w16 w16cex w16sdtdh w16sdtfl w16du wp14">
   <w:abstractNum w:abstractNumId="0" w15:restartNumberingAfterBreak="0">
+    <w:nsid w:val="32C4442D"/>
+    <w:multiLevelType w:val="hybridMultilevel"/>
+    <w:tmpl w:val="D9C61BB6"/>
+    <w:lvl w:ilvl="0" w:tplc="D91EE59A">
+      <w:numFmt w:val="bullet"/>
+      <w:lvlText w:val=""/>
+      <w:lvlJc w:val="left"/>
+      <w:pPr>
+        <w:ind w:left="720" w:hanging="360"/>
+      </w:pPr>
+      <w:rPr>
+        <w:rFonts w:ascii="Symbol" w:eastAsiaTheme="minorHAnsi" w:hAnsi="Symbol" w:cstheme="minorBidi" w:hint="default"/>
+      </w:rPr>
+    </w:lvl>
+    <w:lvl w:ilvl="1" w:tplc="0C0A0003" w:tentative="1">
+      <w:start w:val="1"/>
+      <w:numFmt w:val="bullet"/>
+      <w:lvlText w:val="o"/>
+      <w:lvlJc w:val="left"/>
+      <w:pPr>
+        <w:ind w:left="1440" w:hanging="360"/>
+      </w:pPr>
+      <w:rPr>
+        <w:rFonts w:ascii="Courier New" w:hAnsi="Courier New" w:cs="Courier New" w:hint="default"/>
+      </w:rPr>
+    </w:lvl>
+    <w:lvl w:ilvl="2" w:tplc="0C0A0005" w:tentative="1">
+      <w:start w:val="1"/>
+      <w:numFmt w:val="bullet"/>
+      <w:lvlText w:val=""/>
+      <w:lvlJc w:val="left"/>
+      <w:pPr>
+        <w:ind w:left="2160" w:hanging="360"/>
+      </w:pPr>
+      <w:rPr>
+        <w:rFonts w:ascii="Wingdings" w:hAnsi="Wingdings" w:hint="default"/>
+      </w:rPr>
+    </w:lvl>
+    <w:lvl w:ilvl="3" w:tplc="0C0A0001" w:tentative="1">
+      <w:start w:val="1"/>
+      <w:numFmt w:val="bullet"/>
+      <w:lvlText w:val=""/>
+      <w:lvlJc w:val="left"/>
+      <w:pPr>
+        <w:ind w:left="2880" w:hanging="360"/>
+      </w:pPr>
+      <w:rPr>
+        <w:rFonts w:ascii="Symbol" w:hAnsi="Symbol" w:hint="default"/>
+      </w:rPr>
+    </w:lvl>
+    <w:lvl w:ilvl="4" w:tplc="0C0A0003" w:tentative="1">
+      <w:start w:val="1"/>
+      <w:numFmt w:val="bullet"/>
+      <w:lvlText w:val="o"/>
+      <w:lvlJc w:val="left"/>
+      <w:pPr>
+        <w:ind w:left="3600" w:hanging="360"/>
+      </w:pPr>
+      <w:rPr>
+        <w:rFonts w:ascii="Courier New" w:hAnsi="Courier New" w:cs="Courier New" w:hint="default"/>
+      </w:rPr>
+    </w:lvl>
+    <w:lvl w:ilvl="5" w:tplc="0C0A0005" w:tentative="1">
+      <w:start w:val="1"/>
+      <w:numFmt w:val="bullet"/>
+      <w:lvlText w:val=""/>
+      <w:lvlJc w:val="left"/>
+      <w:pPr>
+        <w:ind w:left="4320" w:hanging="360"/>
+      </w:pPr>
+      <w:rPr>
+        <w:rFonts w:ascii="Wingdings" w:hAnsi="Wingdings" w:hint="default"/>
+      </w:rPr>
+    </w:lvl>
+    <w:lvl w:ilvl="6" w:tplc="0C0A0001" w:tentative="1">
+      <w:start w:val="1"/>
+      <w:numFmt w:val="bullet"/>
+      <w:lvlText w:val=""/>
+      <w:lvlJc w:val="left"/>
+      <w:pPr>
+        <w:ind w:left="5040" w:hanging="360"/>
+      </w:pPr>
+      <w:rPr>
+        <w:rFonts w:ascii="Symbol" w:hAnsi="Symbol" w:hint="default"/>
+      </w:rPr>
+    </w:lvl>
+    <w:lvl w:ilvl="7" w:tplc="0C0A0003" w:tentative="1">
+      <w:start w:val="1"/>
+      <w:numFmt w:val="bullet"/>
+      <w:lvlText w:val="o"/>
+      <w:lvlJc w:val="left"/>
+      <w:pPr>
+        <w:ind w:left="5760" w:hanging="360"/>
+      </w:pPr>
+      <w:rPr>
+        <w:rFonts w:ascii="Courier New" w:hAnsi="Courier New" w:cs="Courier New" w:hint="default"/>
+      </w:rPr>
+    </w:lvl>
+    <w:lvl w:ilvl="8" w:tplc="0C0A0005" w:tentative="1">
+      <w:start w:val="1"/>
+      <w:numFmt w:val="bullet"/>
+      <w:lvlText w:val=""/>
+      <w:lvlJc w:val="left"/>
+      <w:pPr>
+        <w:ind w:left="6480" w:hanging="360"/>
+      </w:pPr>
+      <w:rPr>
+        <w:rFonts w:ascii="Wingdings" w:hAnsi="Wingdings" w:hint="default"/>
+      </w:rPr>
+    </w:lvl>
+  </w:abstractNum>
+  <w:abstractNum w:abstractNumId="1" w15:restartNumberingAfterBreak="0">
     <w:nsid w:val="39094C43"/>
     <w:multiLevelType w:val="hybridMultilevel"/>
     <w:tmpl w:val="1FF42F6E"/>
@@ -1135,7 +1855,7 @@
       </w:rPr>
     </w:lvl>
   </w:abstractNum>
-  <w:abstractNum w:abstractNumId="1" w15:restartNumberingAfterBreak="0">
+  <w:abstractNum w:abstractNumId="2" w15:restartNumberingAfterBreak="0">
     <w:nsid w:val="6D5B01AE"/>
     <w:multiLevelType w:val="multilevel"/>
     <w:tmpl w:val="48F07854"/>
@@ -1284,11 +2004,106 @@
       </w:rPr>
     </w:lvl>
   </w:abstractNum>
+  <w:abstractNum w:abstractNumId="3" w15:restartNumberingAfterBreak="0">
+    <w:nsid w:val="799D3EAF"/>
+    <w:multiLevelType w:val="hybridMultilevel"/>
+    <w:tmpl w:val="7B642720"/>
+    <w:lvl w:ilvl="0" w:tplc="0030A6EE">
+      <w:start w:val="1"/>
+      <w:numFmt w:val="decimal"/>
+      <w:lvlText w:val="%1-"/>
+      <w:lvlJc w:val="left"/>
+      <w:pPr>
+        <w:ind w:left="720" w:hanging="360"/>
+      </w:pPr>
+      <w:rPr>
+        <w:rFonts w:hint="default"/>
+      </w:rPr>
+    </w:lvl>
+    <w:lvl w:ilvl="1" w:tplc="0C0A0019" w:tentative="1">
+      <w:start w:val="1"/>
+      <w:numFmt w:val="lowerLetter"/>
+      <w:lvlText w:val="%2."/>
+      <w:lvlJc w:val="left"/>
+      <w:pPr>
+        <w:ind w:left="1440" w:hanging="360"/>
+      </w:pPr>
+    </w:lvl>
+    <w:lvl w:ilvl="2" w:tplc="0C0A001B" w:tentative="1">
+      <w:start w:val="1"/>
+      <w:numFmt w:val="lowerRoman"/>
+      <w:lvlText w:val="%3."/>
+      <w:lvlJc w:val="right"/>
+      <w:pPr>
+        <w:ind w:left="2160" w:hanging="180"/>
+      </w:pPr>
+    </w:lvl>
+    <w:lvl w:ilvl="3" w:tplc="0C0A000F" w:tentative="1">
+      <w:start w:val="1"/>
+      <w:numFmt w:val="decimal"/>
+      <w:lvlText w:val="%4."/>
+      <w:lvlJc w:val="left"/>
+      <w:pPr>
+        <w:ind w:left="2880" w:hanging="360"/>
+      </w:pPr>
+    </w:lvl>
+    <w:lvl w:ilvl="4" w:tplc="0C0A0019" w:tentative="1">
+      <w:start w:val="1"/>
+      <w:numFmt w:val="lowerLetter"/>
+      <w:lvlText w:val="%5."/>
+      <w:lvlJc w:val="left"/>
+      <w:pPr>
+        <w:ind w:left="3600" w:hanging="360"/>
+      </w:pPr>
+    </w:lvl>
+    <w:lvl w:ilvl="5" w:tplc="0C0A001B" w:tentative="1">
+      <w:start w:val="1"/>
+      <w:numFmt w:val="lowerRoman"/>
+      <w:lvlText w:val="%6."/>
+      <w:lvlJc w:val="right"/>
+      <w:pPr>
+        <w:ind w:left="4320" w:hanging="180"/>
+      </w:pPr>
+    </w:lvl>
+    <w:lvl w:ilvl="6" w:tplc="0C0A000F" w:tentative="1">
+      <w:start w:val="1"/>
+      <w:numFmt w:val="decimal"/>
+      <w:lvlText w:val="%7."/>
+      <w:lvlJc w:val="left"/>
+      <w:pPr>
+        <w:ind w:left="5040" w:hanging="360"/>
+      </w:pPr>
+    </w:lvl>
+    <w:lvl w:ilvl="7" w:tplc="0C0A0019" w:tentative="1">
+      <w:start w:val="1"/>
+      <w:numFmt w:val="lowerLetter"/>
+      <w:lvlText w:val="%8."/>
+      <w:lvlJc w:val="left"/>
+      <w:pPr>
+        <w:ind w:left="5760" w:hanging="360"/>
+      </w:pPr>
+    </w:lvl>
+    <w:lvl w:ilvl="8" w:tplc="0C0A001B" w:tentative="1">
+      <w:start w:val="1"/>
+      <w:numFmt w:val="lowerRoman"/>
+      <w:lvlText w:val="%9."/>
+      <w:lvlJc w:val="right"/>
+      <w:pPr>
+        <w:ind w:left="6480" w:hanging="180"/>
+      </w:pPr>
+    </w:lvl>
+  </w:abstractNum>
   <w:num w:numId="1" w16cid:durableId="2118786589">
+    <w:abstractNumId w:val="1"/>
+  </w:num>
+  <w:num w:numId="2" w16cid:durableId="1472601486">
+    <w:abstractNumId w:val="2"/>
+  </w:num>
+  <w:num w:numId="3" w16cid:durableId="1908957426">
     <w:abstractNumId w:val="0"/>
   </w:num>
-  <w:num w:numId="2" w16cid:durableId="1472601486">
-    <w:abstractNumId w:val="1"/>
+  <w:num w:numId="4" w16cid:durableId="682586145">
+    <w:abstractNumId w:val="3"/>
   </w:num>
 </w:numbering>
 </file>
@@ -1691,7 +2506,7 @@
   <w:style w:type="paragraph" w:default="1" w:styleId="Normal">
     <w:name w:val="Normal"/>
     <w:qFormat/>
-    <w:rsid w:val="009B60C4"/>
+    <w:rsid w:val="00A858F7"/>
     <w:rPr>
       <w:rFonts w:ascii="Times New Roman" w:hAnsi="Times New Roman"/>
     </w:rPr>

</xml_diff>

<commit_message>
Update TPI - 5to commit
Update del informe para el TPI junto con capturas de las pruebas y diccionarios de datos
</commit_message>
<xml_diff>
--- a/Informe Trabajo Práctico Integrador - OE.docx
+++ b/Informe Trabajo Práctico Integrador - OE.docx
@@ -35,10 +35,7 @@
     <w:p>
       <w:pPr>
         <w:rPr>
-          <w:b/>
-          <w:bCs/>
-          <w:sz w:val="24"/>
-          <w:szCs w:val="24"/>
+          <w:lang w:val="es-AR"/>
         </w:rPr>
       </w:pPr>
     </w:p>
@@ -62,15 +59,7 @@
     </w:p>
     <w:p>
       <w:r>
-        <w:t xml:space="preserve">Con el objetivo de optimizar este proceso, se propone el desarrollo de un </w:t>
-      </w:r>
-      <w:proofErr w:type="spellStart"/>
-      <w:r>
-        <w:t>chatbot</w:t>
-      </w:r>
-      <w:proofErr w:type="spellEnd"/>
-      <w:r>
-        <w:t xml:space="preserve"> de Soporte Técnico Nivel 1 capaz de recibir consultas de los usuarios, identificar problemas conocidos y ofrecer soluciones automáticas. En aquellos casos en los que no sea posible resolver el inconveniente, el sistema derivará la solicitud al soporte especializado correspondiente.</w:t>
+        <w:t>Con el objetivo de optimizar este proceso, se propone el desarrollo de un chatbot de Soporte Técnico Nivel 1 capaz de recibir consultas de los usuarios, identificar problemas conocidos y ofrecer soluciones automáticas. En aquellos casos en los que no sea posible resolver el inconveniente, el sistema derivará la solicitud al soporte especializado correspondiente.</w:t>
       </w:r>
     </w:p>
     <w:p>
@@ -127,15 +116,7 @@
     </w:p>
     <w:p>
       <w:r>
-        <w:t xml:space="preserve">Por este motivo, se plantea la implementación de una solución basada en un </w:t>
-      </w:r>
-      <w:proofErr w:type="spellStart"/>
-      <w:r>
-        <w:t>chatbot</w:t>
-      </w:r>
-      <w:proofErr w:type="spellEnd"/>
-      <w:r>
-        <w:t xml:space="preserve"> que permita automatizar la atención inicial de los usuarios y optimizar el proceso de soporte técnico.</w:t>
+        <w:t>Por este motivo, se plantea la implementación de una solución basada en un chatbot que permita automatizar la atención inicial de los usuarios y optimizar el proceso de soporte técnico.</w:t>
       </w:r>
     </w:p>
     <w:p>
@@ -166,15 +147,7 @@
     </w:p>
     <w:p>
       <w:r>
-        <w:t xml:space="preserve">En lugar de que un técnico atienda manualmente todos los casos, el usuario interactuará con un </w:t>
-      </w:r>
-      <w:proofErr w:type="spellStart"/>
-      <w:r>
-        <w:t>chatbot</w:t>
-      </w:r>
-      <w:proofErr w:type="spellEnd"/>
-      <w:r>
-        <w:t xml:space="preserve"> que intentará resolver automáticamente los problemas más frecuentes. Si no puede hacerlo, derivará el caso al soporte de Nivel 2.</w:t>
+        <w:t>En lugar de que un técnico atienda manualmente todos los casos, el usuario interactuará con un chatbot que intentará resolver automáticamente los problemas más frecuentes. Si no puede hacerlo, derivará el caso al soporte de Nivel 2.</w:t>
       </w:r>
     </w:p>
     <w:p>
@@ -195,28 +168,12 @@
     </w:p>
     <w:p>
       <w:r>
-        <w:t xml:space="preserve">Con la implementación del </w:t>
-      </w:r>
-      <w:proofErr w:type="spellStart"/>
-      <w:r>
-        <w:t>chatbot</w:t>
-      </w:r>
-      <w:proofErr w:type="spellEnd"/>
-      <w:r>
-        <w:t xml:space="preserve"> de Soporte Técnico Nivel 1, el usuario podrá iniciar una consulta y describir el inconveniente experimentado.</w:t>
-      </w:r>
-    </w:p>
-    <w:p>
-      <w:r>
-        <w:t xml:space="preserve">El sistema registrará los datos ingresados y consultará una base de conocimientos con soluciones previamente definidas. Si el problema reportado posee una solución conocida, el </w:t>
-      </w:r>
-      <w:proofErr w:type="spellStart"/>
-      <w:r>
-        <w:t>chatbot</w:t>
-      </w:r>
-      <w:proofErr w:type="spellEnd"/>
-      <w:r>
-        <w:t xml:space="preserve"> mostrará las instrucciones correspondientes y solicitará una confirmación al usuario.</w:t>
+        <w:t>Con la implementación del chatbot de Soporte Técnico Nivel 1, el usuario podrá iniciar una consulta y describir el inconveniente experimentado.</w:t>
+      </w:r>
+    </w:p>
+    <w:p>
+      <w:r>
+        <w:t>El sistema registrará los datos ingresados y consultará una base de conocimientos con soluciones previamente definidas. Si el problema reportado posee una solución conocida, el chatbot mostrará las instrucciones correspondientes y solicitará una confirmación al usuario.</w:t>
       </w:r>
     </w:p>
     <w:p>
@@ -257,7 +214,7 @@
                     </pic:cNvPicPr>
                   </pic:nvPicPr>
                   <pic:blipFill>
-                    <a:blip r:embed="rId5" cstate="print">
+                    <a:blip r:embed="rId7" cstate="print">
                       <a:extLst>
                         <a:ext uri="{28A0092B-C50C-407E-A947-70E740481C1C}">
                           <a14:useLocalDpi xmlns:a14="http://schemas.microsoft.com/office/drawing/2010/main" val="0"/>
@@ -292,6 +249,7 @@
     <w:p>
       <w:pPr>
         <w:pStyle w:val="Descripcin"/>
+        <w:jc w:val="center"/>
       </w:pPr>
       <w:r>
         <w:t xml:space="preserve">Ilustración </w:t>
@@ -315,15 +273,7 @@
         <w:fldChar w:fldCharType="end"/>
       </w:r>
       <w:r>
-        <w:t xml:space="preserve">. Diagrama BPMN del proceso de Soporte Técnico Nivel 1 automatizado mediante </w:t>
-      </w:r>
-      <w:proofErr w:type="spellStart"/>
-      <w:r>
-        <w:t>chatbot</w:t>
-      </w:r>
-      <w:proofErr w:type="spellEnd"/>
-      <w:r>
-        <w:t>.</w:t>
+        <w:t>. Diagrama BPMN del proceso de Soporte Técnico Nivel 1 automatizado mediante chatbot.</w:t>
       </w:r>
     </w:p>
     <w:p>
@@ -334,7 +284,6 @@
         <w:t>TECNOLOGÍAS Y HERRAMIENTAS UTILIZADAS</w:t>
       </w:r>
     </w:p>
-    <w:p/>
     <w:tbl>
       <w:tblPr>
         <w:tblStyle w:val="Tablaconcuadrcula"/>
@@ -552,7 +501,9 @@
           <w:lang w:val="es-AR"/>
         </w:rPr>
       </w:pPr>
-      <w:r>
+    </w:p>
+    <w:p>
+      <w:pPr>
         <w:rPr>
           <w:b/>
           <w:bCs/>
@@ -560,6 +511,26 @@
           <w:szCs w:val="24"/>
           <w:lang w:val="es-AR"/>
         </w:rPr>
+      </w:pPr>
+    </w:p>
+    <w:p>
+      <w:pPr>
+        <w:rPr>
+          <w:b/>
+          <w:bCs/>
+          <w:sz w:val="24"/>
+          <w:szCs w:val="24"/>
+          <w:lang w:val="es-AR"/>
+        </w:rPr>
+      </w:pPr>
+      <w:r>
+        <w:rPr>
+          <w:b/>
+          <w:bCs/>
+          <w:sz w:val="24"/>
+          <w:szCs w:val="24"/>
+          <w:lang w:val="es-AR"/>
+        </w:rPr>
         <w:lastRenderedPageBreak/>
         <w:t>BASE DE DATOS</w:t>
       </w:r>
@@ -599,24 +570,24 @@
           <w:szCs w:val="24"/>
           <w:lang w:val="es-AR"/>
         </w:rPr>
-        <w:t>usuarios.csv</w:t>
-      </w:r>
-    </w:p>
-    <w:p>
-      <w:pPr>
-        <w:rPr>
-          <w:sz w:val="24"/>
-          <w:szCs w:val="24"/>
-          <w:lang w:val="es-AR"/>
-        </w:rPr>
-      </w:pPr>
-      <w:r>
-        <w:rPr>
-          <w:sz w:val="24"/>
-          <w:szCs w:val="24"/>
-          <w:lang w:val="es-AR"/>
-        </w:rPr>
-        <w:t>Almacena la información de los usuarios que realizan consultas al sistema.</w:t>
+        <w:t>problemas.csv</w:t>
+      </w:r>
+    </w:p>
+    <w:p>
+      <w:pPr>
+        <w:rPr>
+          <w:sz w:val="24"/>
+          <w:szCs w:val="24"/>
+          <w:lang w:val="es-AR"/>
+        </w:rPr>
+      </w:pPr>
+      <w:r>
+        <w:rPr>
+          <w:sz w:val="24"/>
+          <w:szCs w:val="24"/>
+          <w:lang w:val="es-AR"/>
+        </w:rPr>
+        <w:t>Contiene la base de conocimientos del chatbot, relacionando los problemas más frecuentes con sus respectivas soluciones.</w:t>
       </w:r>
     </w:p>
     <w:p>
@@ -659,7 +630,7 @@
           <w:szCs w:val="24"/>
           <w:lang w:val="es-AR"/>
         </w:rPr>
-        <w:t>id</w:t>
+        <w:t>problema</w:t>
       </w:r>
     </w:p>
     <w:p>
@@ -681,84 +652,24 @@
           <w:szCs w:val="24"/>
           <w:lang w:val="es-AR"/>
         </w:rPr>
-        <w:t>nombre</w:t>
-      </w:r>
-    </w:p>
-    <w:p>
-      <w:pPr>
-        <w:rPr>
-          <w:b/>
-          <w:bCs/>
-          <w:sz w:val="24"/>
-          <w:szCs w:val="24"/>
-          <w:lang w:val="es-AR"/>
-        </w:rPr>
-      </w:pPr>
-      <w:r>
-        <w:rPr>
-          <w:b/>
-          <w:bCs/>
-          <w:sz w:val="24"/>
-          <w:szCs w:val="24"/>
-          <w:lang w:val="es-AR"/>
-        </w:rPr>
-        <w:t>problemas.csv</w:t>
-      </w:r>
-    </w:p>
-    <w:p>
-      <w:pPr>
-        <w:rPr>
-          <w:sz w:val="24"/>
-          <w:szCs w:val="24"/>
-          <w:lang w:val="es-AR"/>
-        </w:rPr>
-      </w:pPr>
-      <w:r>
-        <w:rPr>
-          <w:sz w:val="24"/>
-          <w:szCs w:val="24"/>
-          <w:lang w:val="es-AR"/>
-        </w:rPr>
-        <w:t xml:space="preserve">Contiene la base de conocimientos del </w:t>
-      </w:r>
-      <w:proofErr w:type="spellStart"/>
-      <w:r>
-        <w:rPr>
-          <w:sz w:val="24"/>
-          <w:szCs w:val="24"/>
-          <w:lang w:val="es-AR"/>
-        </w:rPr>
-        <w:t>chatbot</w:t>
-      </w:r>
-      <w:proofErr w:type="spellEnd"/>
-      <w:r>
-        <w:rPr>
-          <w:sz w:val="24"/>
-          <w:szCs w:val="24"/>
-          <w:lang w:val="es-AR"/>
-        </w:rPr>
-        <w:t>, relacionando los problemas más frecuentes con sus respectivas soluciones.</w:t>
-      </w:r>
-    </w:p>
-    <w:p>
-      <w:pPr>
-        <w:rPr>
-          <w:b/>
-          <w:bCs/>
-          <w:sz w:val="24"/>
-          <w:szCs w:val="24"/>
-          <w:lang w:val="es-AR"/>
-        </w:rPr>
-      </w:pPr>
-      <w:r>
-        <w:rPr>
-          <w:b/>
-          <w:bCs/>
-          <w:sz w:val="24"/>
-          <w:szCs w:val="24"/>
-          <w:lang w:val="es-AR"/>
-        </w:rPr>
-        <w:t>Campos:</w:t>
+        <w:t>solucion</w:t>
+      </w:r>
+    </w:p>
+    <w:p>
+      <w:pPr>
+        <w:rPr>
+          <w:sz w:val="24"/>
+          <w:szCs w:val="24"/>
+          <w:lang w:val="es-AR"/>
+        </w:rPr>
+      </w:pPr>
+      <w:r>
+        <w:rPr>
+          <w:sz w:val="24"/>
+          <w:szCs w:val="24"/>
+          <w:lang w:val="es-AR"/>
+        </w:rPr>
+        <w:t>Ejemplos:</w:t>
       </w:r>
     </w:p>
     <w:p>
@@ -780,7 +691,23 @@
           <w:szCs w:val="24"/>
           <w:lang w:val="es-AR"/>
         </w:rPr>
-        <w:t>problema</w:t>
+        <w:t xml:space="preserve">Internet lento </w:t>
+      </w:r>
+      <w:r>
+        <w:rPr>
+          <w:sz w:val="24"/>
+          <w:szCs w:val="24"/>
+          <w:lang w:val="es-AR"/>
+        </w:rPr>
+        <w:sym w:font="Wingdings" w:char="F0E0"/>
+      </w:r>
+      <w:r>
+        <w:rPr>
+          <w:sz w:val="24"/>
+          <w:szCs w:val="24"/>
+          <w:lang w:val="es-AR"/>
+        </w:rPr>
+        <w:t xml:space="preserve"> Reiniciar Router</w:t>
       </w:r>
     </w:p>
     <w:p>
@@ -796,32 +723,29 @@
           <w:lang w:val="es-AR"/>
         </w:rPr>
       </w:pPr>
-      <w:proofErr w:type="spellStart"/>
-      <w:r>
-        <w:rPr>
-          <w:sz w:val="24"/>
-          <w:szCs w:val="24"/>
-          <w:lang w:val="es-AR"/>
-        </w:rPr>
-        <w:t>solucion</w:t>
-      </w:r>
-      <w:proofErr w:type="spellEnd"/>
-    </w:p>
-    <w:p>
-      <w:pPr>
-        <w:rPr>
-          <w:sz w:val="24"/>
-          <w:szCs w:val="24"/>
-          <w:lang w:val="es-AR"/>
-        </w:rPr>
-      </w:pPr>
-      <w:r>
-        <w:rPr>
-          <w:sz w:val="24"/>
-          <w:szCs w:val="24"/>
-          <w:lang w:val="es-AR"/>
-        </w:rPr>
-        <w:t>Ejemplos:</w:t>
+      <w:r>
+        <w:rPr>
+          <w:sz w:val="24"/>
+          <w:szCs w:val="24"/>
+          <w:lang w:val="es-AR"/>
+        </w:rPr>
+        <w:t xml:space="preserve">Impresora no imprime </w:t>
+      </w:r>
+      <w:r>
+        <w:rPr>
+          <w:sz w:val="24"/>
+          <w:szCs w:val="24"/>
+          <w:lang w:val="es-AR"/>
+        </w:rPr>
+        <w:sym w:font="Wingdings" w:char="F0E0"/>
+      </w:r>
+      <w:r>
+        <w:rPr>
+          <w:sz w:val="24"/>
+          <w:szCs w:val="24"/>
+          <w:lang w:val="es-AR"/>
+        </w:rPr>
+        <w:t xml:space="preserve"> Reiniciar servicio de impresión</w:t>
       </w:r>
     </w:p>
     <w:p>
@@ -843,7 +767,7 @@
           <w:szCs w:val="24"/>
           <w:lang w:val="es-AR"/>
         </w:rPr>
-        <w:t xml:space="preserve">Internet lento </w:t>
+        <w:t xml:space="preserve">PC sin sonido </w:t>
       </w:r>
       <w:r>
         <w:rPr>
@@ -859,18 +783,67 @@
           <w:szCs w:val="24"/>
           <w:lang w:val="es-AR"/>
         </w:rPr>
-        <w:t xml:space="preserve"> Reiniciar </w:t>
-      </w:r>
-      <w:proofErr w:type="spellStart"/>
-      <w:r>
-        <w:rPr>
-          <w:sz w:val="24"/>
-          <w:szCs w:val="24"/>
-          <w:lang w:val="es-AR"/>
-        </w:rPr>
-        <w:t>Router</w:t>
-      </w:r>
-      <w:proofErr w:type="spellEnd"/>
+        <w:t xml:space="preserve"> Verificar el dispositivo predeterminado</w:t>
+      </w:r>
+    </w:p>
+    <w:p>
+      <w:pPr>
+        <w:rPr>
+          <w:b/>
+          <w:bCs/>
+          <w:sz w:val="24"/>
+          <w:szCs w:val="24"/>
+          <w:lang w:val="es-AR"/>
+        </w:rPr>
+      </w:pPr>
+      <w:r>
+        <w:rPr>
+          <w:b/>
+          <w:bCs/>
+          <w:sz w:val="24"/>
+          <w:szCs w:val="24"/>
+          <w:lang w:val="es-AR"/>
+        </w:rPr>
+        <w:t>tickets.csv</w:t>
+      </w:r>
+    </w:p>
+    <w:p>
+      <w:pPr>
+        <w:rPr>
+          <w:sz w:val="24"/>
+          <w:szCs w:val="24"/>
+          <w:lang w:val="es-AR"/>
+        </w:rPr>
+      </w:pPr>
+      <w:r>
+        <w:rPr>
+          <w:sz w:val="24"/>
+          <w:szCs w:val="24"/>
+          <w:lang w:val="es-AR"/>
+        </w:rPr>
+        <w:t>Registra las incidencias generadas por los usuarios y el estado final de cada una.</w:t>
+      </w:r>
+    </w:p>
+    <w:p>
+      <w:pPr>
+        <w:rPr>
+          <w:b/>
+          <w:bCs/>
+          <w:sz w:val="24"/>
+          <w:szCs w:val="24"/>
+          <w:lang w:val="es-AR"/>
+        </w:rPr>
+      </w:pPr>
+      <w:r>
+        <w:rPr>
+          <w:b/>
+          <w:bCs/>
+          <w:sz w:val="24"/>
+          <w:szCs w:val="24"/>
+          <w:lang w:val="es-AR"/>
+        </w:rPr>
+        <w:t>Campos:</w:t>
+      </w:r>
     </w:p>
     <w:p>
       <w:pPr>
@@ -891,23 +864,7 @@
           <w:szCs w:val="24"/>
           <w:lang w:val="es-AR"/>
         </w:rPr>
-        <w:t xml:space="preserve">Impresora no imprime </w:t>
-      </w:r>
-      <w:r>
-        <w:rPr>
-          <w:sz w:val="24"/>
-          <w:szCs w:val="24"/>
-          <w:lang w:val="es-AR"/>
-        </w:rPr>
-        <w:sym w:font="Wingdings" w:char="F0E0"/>
-      </w:r>
-      <w:r>
-        <w:rPr>
-          <w:sz w:val="24"/>
-          <w:szCs w:val="24"/>
-          <w:lang w:val="es-AR"/>
-        </w:rPr>
-        <w:t xml:space="preserve"> Reiniciar servicio de impresión</w:t>
+        <w:t>id</w:t>
       </w:r>
     </w:p>
     <w:p>
@@ -929,82 +886,7 @@
           <w:szCs w:val="24"/>
           <w:lang w:val="es-AR"/>
         </w:rPr>
-        <w:t xml:space="preserve">PC sin sonido </w:t>
-      </w:r>
-      <w:r>
-        <w:rPr>
-          <w:sz w:val="24"/>
-          <w:szCs w:val="24"/>
-          <w:lang w:val="es-AR"/>
-        </w:rPr>
-        <w:sym w:font="Wingdings" w:char="F0E0"/>
-      </w:r>
-      <w:r>
-        <w:rPr>
-          <w:sz w:val="24"/>
-          <w:szCs w:val="24"/>
-          <w:lang w:val="es-AR"/>
-        </w:rPr>
-        <w:t xml:space="preserve"> Verificar el dispositivo predeterminado</w:t>
-      </w:r>
-    </w:p>
-    <w:p>
-      <w:pPr>
-        <w:rPr>
-          <w:b/>
-          <w:bCs/>
-          <w:sz w:val="24"/>
-          <w:szCs w:val="24"/>
-          <w:lang w:val="es-AR"/>
-        </w:rPr>
-      </w:pPr>
-      <w:r>
-        <w:rPr>
-          <w:b/>
-          <w:bCs/>
-          <w:sz w:val="24"/>
-          <w:szCs w:val="24"/>
-          <w:lang w:val="es-AR"/>
-        </w:rPr>
-        <w:t>tickets.csv</w:t>
-      </w:r>
-    </w:p>
-    <w:p>
-      <w:pPr>
-        <w:rPr>
-          <w:sz w:val="24"/>
-          <w:szCs w:val="24"/>
-          <w:lang w:val="es-AR"/>
-        </w:rPr>
-      </w:pPr>
-      <w:r>
-        <w:rPr>
-          <w:sz w:val="24"/>
-          <w:szCs w:val="24"/>
-          <w:lang w:val="es-AR"/>
-        </w:rPr>
-        <w:t>Registra las incidencias generadas por los usuarios y el estado final de cada una.</w:t>
-      </w:r>
-    </w:p>
-    <w:p>
-      <w:pPr>
-        <w:rPr>
-          <w:b/>
-          <w:bCs/>
-          <w:sz w:val="24"/>
-          <w:szCs w:val="24"/>
-          <w:lang w:val="es-AR"/>
-        </w:rPr>
-      </w:pPr>
-      <w:r>
-        <w:rPr>
-          <w:b/>
-          <w:bCs/>
-          <w:sz w:val="24"/>
-          <w:szCs w:val="24"/>
-          <w:lang w:val="es-AR"/>
-        </w:rPr>
-        <w:t>Campos:</w:t>
+        <w:t>usuario</w:t>
       </w:r>
     </w:p>
     <w:p>
@@ -1020,16 +902,14 @@
           <w:lang w:val="es-AR"/>
         </w:rPr>
       </w:pPr>
-      <w:proofErr w:type="spellStart"/>
-      <w:r>
-        <w:rPr>
-          <w:sz w:val="24"/>
-          <w:szCs w:val="24"/>
-          <w:lang w:val="es-AR"/>
-        </w:rPr>
-        <w:t>id_ticket</w:t>
-      </w:r>
-      <w:proofErr w:type="spellEnd"/>
+      <w:r>
+        <w:rPr>
+          <w:sz w:val="24"/>
+          <w:szCs w:val="24"/>
+          <w:lang w:val="es-AR"/>
+        </w:rPr>
+        <w:t>problema</w:t>
+      </w:r>
     </w:p>
     <w:p>
       <w:pPr>
@@ -1044,16 +924,891 @@
           <w:lang w:val="es-AR"/>
         </w:rPr>
       </w:pPr>
-      <w:proofErr w:type="spellStart"/>
-      <w:r>
-        <w:rPr>
-          <w:sz w:val="24"/>
-          <w:szCs w:val="24"/>
-          <w:lang w:val="es-AR"/>
-        </w:rPr>
-        <w:t>nombre_usuario</w:t>
-      </w:r>
-      <w:proofErr w:type="spellEnd"/>
+      <w:r>
+        <w:rPr>
+          <w:sz w:val="24"/>
+          <w:szCs w:val="24"/>
+          <w:lang w:val="es-AR"/>
+        </w:rPr>
+        <w:t>estado</w:t>
+      </w:r>
+    </w:p>
+    <w:p>
+      <w:pPr>
+        <w:pStyle w:val="Prrafodelista"/>
+        <w:rPr>
+          <w:sz w:val="24"/>
+          <w:szCs w:val="24"/>
+          <w:lang w:val="es-AR"/>
+        </w:rPr>
+      </w:pPr>
+    </w:p>
+    <w:p>
+      <w:pPr>
+        <w:rPr>
+          <w:b/>
+          <w:bCs/>
+          <w:sz w:val="24"/>
+          <w:szCs w:val="24"/>
+          <w:lang w:val="es-AR"/>
+        </w:rPr>
+      </w:pPr>
+      <w:r>
+        <w:rPr>
+          <w:b/>
+          <w:bCs/>
+          <w:sz w:val="24"/>
+          <w:szCs w:val="24"/>
+          <w:lang w:val="es-AR"/>
+        </w:rPr>
+        <w:t>DICCIONARIO DE DATOS</w:t>
+      </w:r>
+    </w:p>
+    <w:p>
+      <w:pPr>
+        <w:rPr>
+          <w:lang w:val="es-AR"/>
+        </w:rPr>
+      </w:pPr>
+      <w:r>
+        <w:rPr>
+          <w:lang w:val="es-AR"/>
+        </w:rPr>
+        <w:t>El sistema utiliza distintas variables y estructuras para almacenar y gestionar la información correspondiente a las incidencias reportadas por los usuarios.</w:t>
+      </w:r>
+    </w:p>
+    <w:tbl>
+      <w:tblPr>
+        <w:tblStyle w:val="Tablaconcuadrcula"/>
+        <w:tblW w:w="0" w:type="auto"/>
+        <w:jc w:val="center"/>
+        <w:tblBorders>
+          <w:top w:val="none" w:sz="0" w:space="0" w:color="auto"/>
+          <w:left w:val="none" w:sz="0" w:space="0" w:color="auto"/>
+          <w:bottom w:val="none" w:sz="0" w:space="0" w:color="auto"/>
+          <w:right w:val="none" w:sz="0" w:space="0" w:color="auto"/>
+        </w:tblBorders>
+        <w:tblLook w:val="04A0" w:firstRow="1" w:lastRow="0" w:firstColumn="1" w:lastColumn="0" w:noHBand="0" w:noVBand="1"/>
+      </w:tblPr>
+      <w:tblGrid>
+        <w:gridCol w:w="2831"/>
+        <w:gridCol w:w="2831"/>
+        <w:gridCol w:w="2832"/>
+      </w:tblGrid>
+      <w:tr>
+        <w:trPr>
+          <w:jc w:val="center"/>
+        </w:trPr>
+        <w:tc>
+          <w:tcPr>
+            <w:tcW w:w="2831" w:type="dxa"/>
+          </w:tcPr>
+          <w:p>
+            <w:pPr>
+              <w:jc w:val="center"/>
+              <w:rPr>
+                <w:b/>
+                <w:bCs/>
+                <w:sz w:val="24"/>
+                <w:szCs w:val="24"/>
+                <w:lang w:val="es-AR"/>
+              </w:rPr>
+            </w:pPr>
+            <w:r>
+              <w:rPr>
+                <w:b/>
+                <w:bCs/>
+                <w:sz w:val="24"/>
+                <w:szCs w:val="24"/>
+                <w:lang w:val="es-AR"/>
+              </w:rPr>
+              <w:t>Nombre del dato</w:t>
+            </w:r>
+          </w:p>
+        </w:tc>
+        <w:tc>
+          <w:tcPr>
+            <w:tcW w:w="2831" w:type="dxa"/>
+          </w:tcPr>
+          <w:p>
+            <w:pPr>
+              <w:jc w:val="center"/>
+              <w:rPr>
+                <w:b/>
+                <w:bCs/>
+                <w:sz w:val="24"/>
+                <w:szCs w:val="24"/>
+                <w:lang w:val="es-AR"/>
+              </w:rPr>
+            </w:pPr>
+            <w:r>
+              <w:rPr>
+                <w:b/>
+                <w:bCs/>
+                <w:sz w:val="24"/>
+                <w:szCs w:val="24"/>
+              </w:rPr>
+              <w:t>Tipo de dato</w:t>
+            </w:r>
+          </w:p>
+        </w:tc>
+        <w:tc>
+          <w:tcPr>
+            <w:tcW w:w="2832" w:type="dxa"/>
+          </w:tcPr>
+          <w:p>
+            <w:pPr>
+              <w:jc w:val="center"/>
+              <w:rPr>
+                <w:b/>
+                <w:bCs/>
+                <w:sz w:val="24"/>
+                <w:szCs w:val="24"/>
+                <w:lang w:val="es-AR"/>
+              </w:rPr>
+            </w:pPr>
+            <w:r>
+              <w:rPr>
+                <w:b/>
+                <w:bCs/>
+                <w:sz w:val="24"/>
+                <w:szCs w:val="24"/>
+              </w:rPr>
+              <w:t>Descripción</w:t>
+            </w:r>
+          </w:p>
+        </w:tc>
+      </w:tr>
+      <w:tr>
+        <w:trPr>
+          <w:jc w:val="center"/>
+        </w:trPr>
+        <w:tc>
+          <w:tcPr>
+            <w:tcW w:w="2831" w:type="dxa"/>
+          </w:tcPr>
+          <w:p>
+            <w:pPr>
+              <w:rPr>
+                <w:lang w:val="es-AR"/>
+              </w:rPr>
+            </w:pPr>
+            <w:r>
+              <w:rPr>
+                <w:lang w:val="es-AR"/>
+              </w:rPr>
+              <w:t>nombre</w:t>
+            </w:r>
+          </w:p>
+        </w:tc>
+        <w:tc>
+          <w:tcPr>
+            <w:tcW w:w="2831" w:type="dxa"/>
+          </w:tcPr>
+          <w:p>
+            <w:pPr>
+              <w:rPr>
+                <w:lang w:val="es-AR"/>
+              </w:rPr>
+            </w:pPr>
+            <w:r>
+              <w:rPr>
+                <w:lang w:val="es-AR"/>
+              </w:rPr>
+              <w:t>str</w:t>
+            </w:r>
+          </w:p>
+        </w:tc>
+        <w:tc>
+          <w:tcPr>
+            <w:tcW w:w="2832" w:type="dxa"/>
+          </w:tcPr>
+          <w:p>
+            <w:pPr>
+              <w:rPr>
+                <w:lang w:val="es-AR"/>
+              </w:rPr>
+            </w:pPr>
+            <w:r>
+              <w:rPr>
+                <w:lang w:val="es-AR"/>
+              </w:rPr>
+              <w:t>Nombre ingresador por el usuario que solicita soporte técnico</w:t>
+            </w:r>
+          </w:p>
+        </w:tc>
+      </w:tr>
+      <w:tr>
+        <w:trPr>
+          <w:jc w:val="center"/>
+        </w:trPr>
+        <w:tc>
+          <w:tcPr>
+            <w:tcW w:w="2831" w:type="dxa"/>
+          </w:tcPr>
+          <w:p>
+            <w:pPr>
+              <w:rPr>
+                <w:lang w:val="es-AR"/>
+              </w:rPr>
+            </w:pPr>
+            <w:r>
+              <w:rPr>
+                <w:lang w:val="es-AR"/>
+              </w:rPr>
+              <w:t>problema</w:t>
+            </w:r>
+          </w:p>
+        </w:tc>
+        <w:tc>
+          <w:tcPr>
+            <w:tcW w:w="2831" w:type="dxa"/>
+          </w:tcPr>
+          <w:p>
+            <w:pPr>
+              <w:rPr>
+                <w:lang w:val="es-AR"/>
+              </w:rPr>
+            </w:pPr>
+            <w:r>
+              <w:rPr>
+                <w:lang w:val="es-AR"/>
+              </w:rPr>
+              <w:t>str</w:t>
+            </w:r>
+          </w:p>
+        </w:tc>
+        <w:tc>
+          <w:tcPr>
+            <w:tcW w:w="2832" w:type="dxa"/>
+          </w:tcPr>
+          <w:p>
+            <w:pPr>
+              <w:rPr>
+                <w:lang w:val="es-AR"/>
+              </w:rPr>
+            </w:pPr>
+            <w:r>
+              <w:rPr>
+                <w:lang w:val="es-AR"/>
+              </w:rPr>
+              <w:t>Inconveniente reportado por el usuario</w:t>
+            </w:r>
+          </w:p>
+        </w:tc>
+      </w:tr>
+      <w:tr>
+        <w:trPr>
+          <w:jc w:val="center"/>
+        </w:trPr>
+        <w:tc>
+          <w:tcPr>
+            <w:tcW w:w="2831" w:type="dxa"/>
+          </w:tcPr>
+          <w:p>
+            <w:pPr>
+              <w:rPr>
+                <w:lang w:val="es-AR"/>
+              </w:rPr>
+            </w:pPr>
+            <w:r>
+              <w:rPr>
+                <w:lang w:val="es-AR"/>
+              </w:rPr>
+              <w:t>solucion</w:t>
+            </w:r>
+          </w:p>
+        </w:tc>
+        <w:tc>
+          <w:tcPr>
+            <w:tcW w:w="2831" w:type="dxa"/>
+          </w:tcPr>
+          <w:p>
+            <w:pPr>
+              <w:rPr>
+                <w:lang w:val="es-AR"/>
+              </w:rPr>
+            </w:pPr>
+            <w:r>
+              <w:rPr>
+                <w:lang w:val="es-AR"/>
+              </w:rPr>
+              <w:t>str</w:t>
+            </w:r>
+          </w:p>
+        </w:tc>
+        <w:tc>
+          <w:tcPr>
+            <w:tcW w:w="2832" w:type="dxa"/>
+          </w:tcPr>
+          <w:p>
+            <w:pPr>
+              <w:rPr>
+                <w:lang w:val="es-AR"/>
+              </w:rPr>
+            </w:pPr>
+            <w:r>
+              <w:rPr>
+                <w:lang w:val="es-AR"/>
+              </w:rPr>
+              <w:t xml:space="preserve">Solución asociada al problema encontrado en la base de </w:t>
+            </w:r>
+            <w:r>
+              <w:rPr>
+                <w:lang w:val="es-AR"/>
+              </w:rPr>
+              <w:t>datos</w:t>
+            </w:r>
+          </w:p>
+        </w:tc>
+      </w:tr>
+      <w:tr>
+        <w:trPr>
+          <w:jc w:val="center"/>
+        </w:trPr>
+        <w:tc>
+          <w:tcPr>
+            <w:tcW w:w="2831" w:type="dxa"/>
+          </w:tcPr>
+          <w:p>
+            <w:pPr>
+              <w:rPr>
+                <w:lang w:val="es-AR"/>
+              </w:rPr>
+            </w:pPr>
+            <w:r>
+              <w:rPr>
+                <w:lang w:val="es-AR"/>
+              </w:rPr>
+              <w:t>respuesta</w:t>
+            </w:r>
+          </w:p>
+        </w:tc>
+        <w:tc>
+          <w:tcPr>
+            <w:tcW w:w="2831" w:type="dxa"/>
+          </w:tcPr>
+          <w:p>
+            <w:pPr>
+              <w:rPr>
+                <w:lang w:val="es-AR"/>
+              </w:rPr>
+            </w:pPr>
+            <w:r>
+              <w:rPr>
+                <w:lang w:val="es-AR"/>
+              </w:rPr>
+              <w:t>str</w:t>
+            </w:r>
+          </w:p>
+        </w:tc>
+        <w:tc>
+          <w:tcPr>
+            <w:tcW w:w="2832" w:type="dxa"/>
+          </w:tcPr>
+          <w:p>
+            <w:pPr>
+              <w:rPr>
+                <w:lang w:val="es-AR"/>
+              </w:rPr>
+            </w:pPr>
+            <w:r>
+              <w:rPr>
+                <w:lang w:val="es-AR"/>
+              </w:rPr>
+              <w:t>Respuesta del usuario indicando si la solución funcionó</w:t>
+            </w:r>
+          </w:p>
+        </w:tc>
+      </w:tr>
+      <w:tr>
+        <w:trPr>
+          <w:jc w:val="center"/>
+        </w:trPr>
+        <w:tc>
+          <w:tcPr>
+            <w:tcW w:w="2831" w:type="dxa"/>
+          </w:tcPr>
+          <w:p>
+            <w:pPr>
+              <w:rPr>
+                <w:lang w:val="es-AR"/>
+              </w:rPr>
+            </w:pPr>
+            <w:r>
+              <w:rPr>
+                <w:lang w:val="es-AR"/>
+              </w:rPr>
+              <w:t>estado</w:t>
+            </w:r>
+          </w:p>
+        </w:tc>
+        <w:tc>
+          <w:tcPr>
+            <w:tcW w:w="2831" w:type="dxa"/>
+          </w:tcPr>
+          <w:p>
+            <w:pPr>
+              <w:rPr>
+                <w:lang w:val="es-AR"/>
+              </w:rPr>
+            </w:pPr>
+            <w:r>
+              <w:rPr>
+                <w:lang w:val="es-AR"/>
+              </w:rPr>
+              <w:t>str</w:t>
+            </w:r>
+          </w:p>
+        </w:tc>
+        <w:tc>
+          <w:tcPr>
+            <w:tcW w:w="2832" w:type="dxa"/>
+          </w:tcPr>
+          <w:p>
+            <w:pPr>
+              <w:rPr>
+                <w:lang w:val="es-AR"/>
+              </w:rPr>
+            </w:pPr>
+            <w:r>
+              <w:rPr>
+                <w:lang w:val="es-AR"/>
+              </w:rPr>
+              <w:t>Estado actual del ticket durante su ciclo de vida</w:t>
+            </w:r>
+          </w:p>
+        </w:tc>
+      </w:tr>
+      <w:tr>
+        <w:trPr>
+          <w:jc w:val="center"/>
+        </w:trPr>
+        <w:tc>
+          <w:tcPr>
+            <w:tcW w:w="2831" w:type="dxa"/>
+          </w:tcPr>
+          <w:p>
+            <w:pPr>
+              <w:rPr>
+                <w:lang w:val="es-AR"/>
+              </w:rPr>
+            </w:pPr>
+            <w:r>
+              <w:rPr>
+                <w:lang w:val="es-AR"/>
+              </w:rPr>
+              <w:t>tickets.csv</w:t>
+            </w:r>
+          </w:p>
+        </w:tc>
+        <w:tc>
+          <w:tcPr>
+            <w:tcW w:w="2831" w:type="dxa"/>
+          </w:tcPr>
+          <w:p>
+            <w:pPr>
+              <w:rPr>
+                <w:lang w:val="es-AR"/>
+              </w:rPr>
+            </w:pPr>
+            <w:r>
+              <w:rPr>
+                <w:lang w:val="es-AR"/>
+              </w:rPr>
+              <w:t>Archivo CSV</w:t>
+            </w:r>
+          </w:p>
+        </w:tc>
+        <w:tc>
+          <w:tcPr>
+            <w:tcW w:w="2832" w:type="dxa"/>
+          </w:tcPr>
+          <w:p>
+            <w:pPr>
+              <w:rPr>
+                <w:lang w:val="es-AR"/>
+              </w:rPr>
+            </w:pPr>
+            <w:r>
+              <w:rPr>
+                <w:lang w:val="es-AR"/>
+              </w:rPr>
+              <w:t>Almacena el historial de tickets registrados</w:t>
+            </w:r>
+          </w:p>
+        </w:tc>
+      </w:tr>
+      <w:tr>
+        <w:trPr>
+          <w:jc w:val="center"/>
+        </w:trPr>
+        <w:tc>
+          <w:tcPr>
+            <w:tcW w:w="2831" w:type="dxa"/>
+          </w:tcPr>
+          <w:p>
+            <w:pPr>
+              <w:rPr>
+                <w:lang w:val="es-AR"/>
+              </w:rPr>
+            </w:pPr>
+            <w:r>
+              <w:rPr>
+                <w:lang w:val="es-AR"/>
+              </w:rPr>
+              <w:t>problemas.csv</w:t>
+            </w:r>
+          </w:p>
+        </w:tc>
+        <w:tc>
+          <w:tcPr>
+            <w:tcW w:w="2831" w:type="dxa"/>
+          </w:tcPr>
+          <w:p>
+            <w:pPr>
+              <w:rPr>
+                <w:lang w:val="es-AR"/>
+              </w:rPr>
+            </w:pPr>
+            <w:r>
+              <w:rPr>
+                <w:lang w:val="es-AR"/>
+              </w:rPr>
+              <w:t>Archivo CSV</w:t>
+            </w:r>
+          </w:p>
+        </w:tc>
+        <w:tc>
+          <w:tcPr>
+            <w:tcW w:w="2832" w:type="dxa"/>
+          </w:tcPr>
+          <w:p>
+            <w:pPr>
+              <w:rPr>
+                <w:lang w:val="es-AR"/>
+              </w:rPr>
+            </w:pPr>
+            <w:r>
+              <w:rPr>
+                <w:lang w:val="es-AR"/>
+              </w:rPr>
+              <w:t>Contiene los problemas conocidos y sus soluciones</w:t>
+            </w:r>
+          </w:p>
+        </w:tc>
+      </w:tr>
+      <w:tr>
+        <w:trPr>
+          <w:jc w:val="center"/>
+        </w:trPr>
+        <w:tc>
+          <w:tcPr>
+            <w:tcW w:w="2831" w:type="dxa"/>
+          </w:tcPr>
+          <w:p>
+            <w:pPr>
+              <w:rPr>
+                <w:lang w:val="es-AR"/>
+              </w:rPr>
+            </w:pPr>
+            <w:r>
+              <w:rPr>
+                <w:lang w:val="es-AR"/>
+              </w:rPr>
+              <w:t>tickets_path</w:t>
+            </w:r>
+          </w:p>
+        </w:tc>
+        <w:tc>
+          <w:tcPr>
+            <w:tcW w:w="2831" w:type="dxa"/>
+          </w:tcPr>
+          <w:p>
+            <w:pPr>
+              <w:rPr>
+                <w:lang w:val="es-AR"/>
+              </w:rPr>
+            </w:pPr>
+            <w:r>
+              <w:rPr>
+                <w:lang w:val="es-AR"/>
+              </w:rPr>
+              <w:t xml:space="preserve">str </w:t>
+            </w:r>
+          </w:p>
+        </w:tc>
+        <w:tc>
+          <w:tcPr>
+            <w:tcW w:w="2832" w:type="dxa"/>
+          </w:tcPr>
+          <w:p>
+            <w:pPr>
+              <w:rPr>
+                <w:lang w:val="es-AR"/>
+              </w:rPr>
+            </w:pPr>
+            <w:r>
+              <w:rPr>
+                <w:lang w:val="es-AR"/>
+              </w:rPr>
+              <w:t>Ruta del archivo tickets.csv</w:t>
+            </w:r>
+          </w:p>
+        </w:tc>
+      </w:tr>
+      <w:tr>
+        <w:trPr>
+          <w:jc w:val="center"/>
+        </w:trPr>
+        <w:tc>
+          <w:tcPr>
+            <w:tcW w:w="2831" w:type="dxa"/>
+          </w:tcPr>
+          <w:p>
+            <w:pPr>
+              <w:rPr>
+                <w:lang w:val="es-AR"/>
+              </w:rPr>
+            </w:pPr>
+            <w:r>
+              <w:rPr>
+                <w:lang w:val="es-AR"/>
+              </w:rPr>
+              <w:lastRenderedPageBreak/>
+              <w:t>problemas_path</w:t>
+            </w:r>
+          </w:p>
+        </w:tc>
+        <w:tc>
+          <w:tcPr>
+            <w:tcW w:w="2831" w:type="dxa"/>
+          </w:tcPr>
+          <w:p>
+            <w:pPr>
+              <w:rPr>
+                <w:lang w:val="es-AR"/>
+              </w:rPr>
+            </w:pPr>
+            <w:r>
+              <w:rPr>
+                <w:lang w:val="es-AR"/>
+              </w:rPr>
+              <w:t>str</w:t>
+            </w:r>
+          </w:p>
+        </w:tc>
+        <w:tc>
+          <w:tcPr>
+            <w:tcW w:w="2832" w:type="dxa"/>
+          </w:tcPr>
+          <w:p>
+            <w:pPr>
+              <w:rPr>
+                <w:lang w:val="es-AR"/>
+              </w:rPr>
+            </w:pPr>
+            <w:r>
+              <w:rPr>
+                <w:lang w:val="es-AR"/>
+              </w:rPr>
+              <w:t>Ruta del archivo problemas.csv</w:t>
+            </w:r>
+          </w:p>
+        </w:tc>
+      </w:tr>
+    </w:tbl>
+    <w:p>
+      <w:pPr>
+        <w:rPr>
+          <w:lang w:val="es-AR"/>
+        </w:rPr>
+      </w:pPr>
+    </w:p>
+    <w:p>
+      <w:pPr>
+        <w:rPr>
+          <w:sz w:val="24"/>
+          <w:szCs w:val="24"/>
+          <w:lang w:val="es-AR"/>
+        </w:rPr>
+      </w:pPr>
+      <w:r>
+        <w:rPr>
+          <w:b/>
+          <w:bCs/>
+          <w:sz w:val="24"/>
+          <w:szCs w:val="24"/>
+          <w:lang w:val="es-AR"/>
+        </w:rPr>
+        <w:t>MÁQUINA DE ESTADOS</w:t>
+      </w:r>
+    </w:p>
+    <w:p>
+      <w:pPr>
+        <w:rPr>
+          <w:lang w:val="es-AR"/>
+        </w:rPr>
+      </w:pPr>
+      <w:r>
+        <w:rPr>
+          <w:lang w:val="es-AR"/>
+        </w:rPr>
+        <w:t>El sistema implementa una Máquina de Estados Finitos (FSM), donde cada ticket atraviesa distintas etapas según las acciones realizadas y las respuestas proporcionadas por el usuario.</w:t>
+      </w:r>
+      <w:r>
+        <w:rPr>
+          <w:lang w:val="es-AR"/>
+        </w:rPr>
+        <w:t xml:space="preserve"> </w:t>
+      </w:r>
+    </w:p>
+    <w:p>
+      <w:pPr>
+        <w:rPr>
+          <w:lang w:val="es-AR"/>
+        </w:rPr>
+      </w:pPr>
+      <w:r>
+        <w:rPr>
+          <w:lang w:val="es-AR"/>
+        </w:rPr>
+        <w:t>Los estados definidos son:</w:t>
+      </w:r>
+    </w:p>
+    <w:p>
+      <w:pPr>
+        <w:rPr>
+          <w:lang w:val="es-AR"/>
+        </w:rPr>
+      </w:pPr>
+      <w:r>
+        <w:rPr>
+          <w:lang w:val="es-AR"/>
+        </w:rPr>
+        <w:t xml:space="preserve">ABIERTO: </w:t>
+      </w:r>
+      <w:r>
+        <w:t>Representa la creación inicial del ticket y la recepción del problema reportado.</w:t>
+      </w:r>
+    </w:p>
+    <w:p>
+      <w:r>
+        <w:rPr>
+          <w:lang w:val="es-AR"/>
+        </w:rPr>
+        <w:t xml:space="preserve">EN ANÁLISIS: </w:t>
+      </w:r>
+      <w:r>
+        <w:t>El sistema consulta la base de conocimientos en busca de una solución asociada al inconveniente.</w:t>
+      </w:r>
+    </w:p>
+    <w:p>
+      <w:pPr>
+        <w:rPr>
+          <w:lang w:val="es-AR"/>
+        </w:rPr>
+      </w:pPr>
+      <w:r>
+        <w:rPr>
+          <w:lang w:val="es-AR"/>
+        </w:rPr>
+        <w:t xml:space="preserve">SOLUCIÓN ENCONTRADA: </w:t>
+      </w:r>
+      <w:r>
+        <w:t>Se encontró una posible solución y esta es mostrada al usuario.</w:t>
+      </w:r>
+    </w:p>
+    <w:p>
+      <w:pPr>
+        <w:rPr>
+          <w:lang w:val="es-AR"/>
+        </w:rPr>
+      </w:pPr>
+      <w:r>
+        <w:rPr>
+          <w:lang w:val="es-AR"/>
+        </w:rPr>
+        <w:t>RESUELTO</w:t>
+      </w:r>
+      <w:r>
+        <w:rPr>
+          <w:lang w:val="es-AR"/>
+        </w:rPr>
+        <w:t xml:space="preserve">: </w:t>
+      </w:r>
+      <w:r>
+        <w:t>El usuario confirma que la solución proporcionada resolvió el inconveniente.</w:t>
+      </w:r>
+    </w:p>
+    <w:p>
+      <w:pPr>
+        <w:rPr>
+          <w:lang w:val="es-AR"/>
+        </w:rPr>
+      </w:pPr>
+      <w:r>
+        <w:rPr>
+          <w:lang w:val="es-AR"/>
+        </w:rPr>
+        <w:t xml:space="preserve">DERIVADO A NIVEL 2: </w:t>
+      </w:r>
+      <w:r>
+        <w:t>No se encontró una solución o la respuesta ofrecida no resolvió el problema, por lo que el caso es escalado al soporte especializado.</w:t>
+      </w:r>
+    </w:p>
+    <w:p>
+      <w:pPr>
+        <w:rPr>
+          <w:lang w:val="es-AR"/>
+        </w:rPr>
+      </w:pPr>
+      <w:r>
+        <w:rPr>
+          <w:lang w:val="es-AR"/>
+        </w:rPr>
+        <w:t>CERRADO: finalización del ciclo de vida del ticket.</w:t>
+      </w:r>
+    </w:p>
+    <w:p>
+      <w:pPr>
+        <w:rPr>
+          <w:rFonts w:cs="Times New Roman"/>
+          <w:lang w:val="es-AR"/>
+        </w:rPr>
+      </w:pPr>
+      <w:r>
+        <w:rPr>
+          <w:rFonts w:cs="Times New Roman"/>
+        </w:rPr>
+        <w:t>El uso de una máquina de estados permite representar de forma clara la lógica del proceso modelado mediante BPMN y facilita el control de las distintas situaciones que pueden presentarse durante la atención de incidencias.</w:t>
+      </w:r>
+    </w:p>
+    <w:p>
+      <w:pPr>
+        <w:rPr>
+          <w:b/>
+          <w:bCs/>
+          <w:sz w:val="24"/>
+          <w:szCs w:val="24"/>
+          <w:lang w:val="es-AR"/>
+        </w:rPr>
+      </w:pPr>
+      <w:r>
+        <w:rPr>
+          <w:b/>
+          <w:bCs/>
+          <w:sz w:val="24"/>
+          <w:szCs w:val="24"/>
+          <w:lang w:val="es-AR"/>
+        </w:rPr>
+        <w:t>PRUEBAS</w:t>
+      </w:r>
+    </w:p>
+    <w:p>
+      <w:r>
+        <w:t>Para verificar el correcto funcionamiento del sistema se consideraron diferentes escenarios:</w:t>
+      </w:r>
     </w:p>
     <w:p>
       <w:pPr>
@@ -1062,19 +1817,107 @@
           <w:ilvl w:val="0"/>
           <w:numId w:val="3"/>
         </w:numPr>
-        <w:rPr>
-          <w:sz w:val="24"/>
-          <w:szCs w:val="24"/>
-          <w:lang w:val="es-AR"/>
-        </w:rPr>
-      </w:pPr>
-      <w:r>
-        <w:rPr>
-          <w:sz w:val="24"/>
-          <w:szCs w:val="24"/>
-          <w:lang w:val="es-AR"/>
-        </w:rPr>
-        <w:t>problema</w:t>
+      </w:pPr>
+      <w:r>
+        <w:rPr>
+          <w:b/>
+          <w:bCs/>
+        </w:rPr>
+        <w:t>Problema encontrado y resuelto:</w:t>
+      </w:r>
+      <w:r>
+        <w:br/>
+        <w:t>El sistema localiza una solución en la base de conocimientos y el usuario confirma que esta resolvió el inconveniente. El ticket se cierra correctamente.</w:t>
+      </w:r>
+    </w:p>
+    <w:p>
+      <w:pPr>
+        <w:pStyle w:val="Prrafodelista"/>
+      </w:pPr>
+    </w:p>
+    <w:p>
+      <w:pPr>
+        <w:pStyle w:val="Prrafodelista"/>
+        <w:keepNext/>
+      </w:pPr>
+      <w:r>
+        <w:drawing>
+          <wp:inline distT="0" distB="0" distL="0" distR="0" wp14:anchorId="24868F80" wp14:editId="1EDB1FD2">
+            <wp:extent cx="4153480" cy="3181794"/>
+            <wp:effectExtent l="95250" t="95250" r="95250" b="95250"/>
+            <wp:docPr id="1860657548" name="Imagen 1"/>
+            <wp:cNvGraphicFramePr>
+              <a:graphicFrameLocks xmlns:a="http://schemas.openxmlformats.org/drawingml/2006/main" noChangeAspect="1"/>
+            </wp:cNvGraphicFramePr>
+            <a:graphic xmlns:a="http://schemas.openxmlformats.org/drawingml/2006/main">
+              <a:graphicData uri="http://schemas.openxmlformats.org/drawingml/2006/picture">
+                <pic:pic xmlns:pic="http://schemas.openxmlformats.org/drawingml/2006/picture">
+                  <pic:nvPicPr>
+                    <pic:cNvPr id="1860657548" name=""/>
+                    <pic:cNvPicPr/>
+                  </pic:nvPicPr>
+                  <pic:blipFill>
+                    <a:blip r:embed="rId8"/>
+                    <a:stretch>
+                      <a:fillRect/>
+                    </a:stretch>
+                  </pic:blipFill>
+                  <pic:spPr>
+                    <a:xfrm>
+                      <a:off x="0" y="0"/>
+                      <a:ext cx="4153480" cy="3181794"/>
+                    </a:xfrm>
+                    <a:prstGeom prst="rect">
+                      <a:avLst/>
+                    </a:prstGeom>
+                    <a:ln w="88900" cap="sq" cmpd="thickThin">
+                      <a:solidFill>
+                        <a:srgbClr val="000000"/>
+                      </a:solidFill>
+                      <a:prstDash val="solid"/>
+                      <a:miter lim="800000"/>
+                    </a:ln>
+                    <a:effectLst>
+                      <a:innerShdw blurRad="76200">
+                        <a:srgbClr val="000000"/>
+                      </a:innerShdw>
+                    </a:effectLst>
+                  </pic:spPr>
+                </pic:pic>
+              </a:graphicData>
+            </a:graphic>
+          </wp:inline>
+        </w:drawing>
+      </w:r>
+    </w:p>
+    <w:p>
+      <w:pPr>
+        <w:pStyle w:val="Descripcin"/>
+        <w:jc w:val="center"/>
+      </w:pPr>
+      <w:r>
+        <w:t xml:space="preserve">Ilustración </w:t>
+      </w:r>
+      <w:r>
+        <w:fldChar w:fldCharType="begin"/>
+      </w:r>
+      <w:r>
+        <w:instrText xml:space="preserve"> SEQ Ilustración \* ARABIC </w:instrText>
+      </w:r>
+      <w:r>
+        <w:fldChar w:fldCharType="separate"/>
+      </w:r>
+      <w:r>
+        <w:rPr>
+          <w:noProof/>
+        </w:rPr>
+        <w:t>2</w:t>
+      </w:r>
+      <w:r>
+        <w:fldChar w:fldCharType="end"/>
+      </w:r>
+      <w:r>
+        <w:t>. Captura de pantalla de del sistema, encontrando y solucionando el problema.</w:t>
       </w:r>
     </w:p>
     <w:p>
@@ -1084,215 +1927,118 @@
           <w:ilvl w:val="0"/>
           <w:numId w:val="3"/>
         </w:numPr>
-        <w:rPr>
-          <w:sz w:val="24"/>
-          <w:szCs w:val="24"/>
-          <w:lang w:val="es-AR"/>
-        </w:rPr>
-      </w:pPr>
-      <w:r>
-        <w:rPr>
-          <w:sz w:val="24"/>
-          <w:szCs w:val="24"/>
-          <w:lang w:val="es-AR"/>
-        </w:rPr>
-        <w:t>estado</w:t>
-      </w:r>
-    </w:p>
-    <w:p>
-      <w:pPr>
-        <w:rPr>
-          <w:sz w:val="24"/>
-          <w:szCs w:val="24"/>
-          <w:lang w:val="es-AR"/>
-        </w:rPr>
-      </w:pPr>
-    </w:p>
-    <w:p>
-      <w:pPr>
-        <w:rPr>
-          <w:sz w:val="24"/>
-          <w:szCs w:val="24"/>
-          <w:lang w:val="es-AR"/>
-        </w:rPr>
       </w:pPr>
       <w:r>
         <w:rPr>
           <w:b/>
           <w:bCs/>
-          <w:sz w:val="24"/>
-          <w:szCs w:val="24"/>
-          <w:lang w:val="es-AR"/>
-        </w:rPr>
-        <w:t>MÁQUINA DE ESTADOS</w:t>
-      </w:r>
-    </w:p>
-    <w:p>
-      <w:pPr>
-        <w:rPr>
-          <w:lang w:val="es-AR"/>
-        </w:rPr>
-      </w:pPr>
-      <w:r>
-        <w:rPr>
-          <w:lang w:val="es-AR"/>
-        </w:rPr>
-        <w:t>El sistema implementa una Máquina de Estados Finitos (FSM), donde cada ticket atraviesa distintas etapas según las acciones realizadas y las respuestas proporcionadas por el usuario.</w:t>
-      </w:r>
-      <w:r>
-        <w:rPr>
-          <w:lang w:val="es-AR"/>
-        </w:rPr>
-        <w:t xml:space="preserve"> </w:t>
-      </w:r>
-    </w:p>
-    <w:p>
-      <w:pPr>
-        <w:rPr>
-          <w:lang w:val="es-AR"/>
-        </w:rPr>
-      </w:pPr>
-      <w:r>
-        <w:rPr>
-          <w:lang w:val="es-AR"/>
-        </w:rPr>
-        <w:t>Los estados definidos son:</w:t>
-      </w:r>
-    </w:p>
-    <w:p>
-      <w:pPr>
-        <w:rPr>
-          <w:lang w:val="es-AR"/>
-        </w:rPr>
-      </w:pPr>
-      <w:r>
-        <w:rPr>
-          <w:lang w:val="es-AR"/>
-        </w:rPr>
-        <w:t xml:space="preserve">ABIERTO: </w:t>
-      </w:r>
-      <w:r>
-        <w:t>Representa la creación inicial del ticket y la recepción del problema reportado.</w:t>
-      </w:r>
-    </w:p>
-    <w:p>
-      <w:r>
-        <w:rPr>
-          <w:lang w:val="es-AR"/>
-        </w:rPr>
-        <w:t xml:space="preserve">EN ANÁLISIS: </w:t>
-      </w:r>
-      <w:r>
-        <w:t>El sistema consulta la base de conocimientos en busca de una solución asociada al inconveniente.</w:t>
-      </w:r>
-    </w:p>
-    <w:p>
-      <w:pPr>
-        <w:rPr>
-          <w:lang w:val="es-AR"/>
-        </w:rPr>
-      </w:pPr>
-      <w:r>
-        <w:rPr>
-          <w:lang w:val="es-AR"/>
-        </w:rPr>
-        <w:t xml:space="preserve">SOLUCIÓN ENCONTRADA: </w:t>
-      </w:r>
-      <w:r>
-        <w:t>Se encontró una posible solución y esta es mostrada al usuario.</w:t>
-      </w:r>
-    </w:p>
-    <w:p>
-      <w:pPr>
-        <w:rPr>
-          <w:lang w:val="es-AR"/>
-        </w:rPr>
-      </w:pPr>
-      <w:r>
-        <w:rPr>
-          <w:lang w:val="es-AR"/>
         </w:rPr>
         <w:lastRenderedPageBreak/>
-        <w:t>RESUELTO</w:t>
-      </w:r>
-      <w:r>
-        <w:rPr>
-          <w:lang w:val="es-AR"/>
-        </w:rPr>
-        <w:t xml:space="preserve">: </w:t>
-      </w:r>
-      <w:r>
-        <w:t>El usuario confirma que la solución proporcionada resolvió el inconveniente.</w:t>
-      </w:r>
-    </w:p>
-    <w:p>
-      <w:pPr>
-        <w:rPr>
-          <w:lang w:val="es-AR"/>
-        </w:rPr>
-      </w:pPr>
-      <w:r>
-        <w:rPr>
-          <w:lang w:val="es-AR"/>
-        </w:rPr>
-        <w:t xml:space="preserve">DERIVADO A NIVEL 2: </w:t>
-      </w:r>
-      <w:r>
-        <w:t>No se encontró una solución o la respuesta ofrecida no resolvió el problema, por lo que el caso es escalado al soporte especializado.</w:t>
-      </w:r>
-    </w:p>
-    <w:p>
-      <w:pPr>
-        <w:rPr>
-          <w:lang w:val="es-AR"/>
-        </w:rPr>
-      </w:pPr>
-      <w:r>
-        <w:rPr>
-          <w:lang w:val="es-AR"/>
-        </w:rPr>
-        <w:t>CERRADO: finalización del ciclo de vida del ticket.</w:t>
-      </w:r>
-    </w:p>
-    <w:p>
-      <w:pPr>
-        <w:rPr>
-          <w:rFonts w:cs="Times New Roman"/>
-          <w:lang w:val="es-AR"/>
-        </w:rPr>
-      </w:pPr>
-      <w:r>
-        <w:rPr>
-          <w:rFonts w:cs="Times New Roman"/>
-        </w:rPr>
-        <w:t>El uso de una máquina de estados permite representar de forma clara la lógica del proceso modelado mediante BPMN y facilita el control de las distintas situaciones que pueden presentarse durante la atención de incidencias.</w:t>
-      </w:r>
-    </w:p>
-    <w:p>
-      <w:pPr>
+        <w:t>Problema encontrado, pero no resuelto:</w:t>
+      </w:r>
+      <w:r>
+        <w:br/>
+        <w:t>El sistema propone una solución, pero el usuario indica que esta no solucionó el problema. El ticket es derivado al soporte de Nivel 2.</w:t>
+      </w:r>
+    </w:p>
+    <w:p>
+      <w:pPr>
+        <w:pStyle w:val="Prrafodelista"/>
         <w:rPr>
           <w:b/>
           <w:bCs/>
-          <w:sz w:val="24"/>
-          <w:szCs w:val="24"/>
-          <w:lang w:val="es-AR"/>
-        </w:rPr>
-      </w:pPr>
-      <w:r>
-        <w:rPr>
-          <w:b/>
-          <w:bCs/>
-          <w:sz w:val="24"/>
-          <w:szCs w:val="24"/>
-          <w:lang w:val="es-AR"/>
-        </w:rPr>
-        <w:t>PRUEBAS</w:t>
-      </w:r>
-    </w:p>
-    <w:p>
-      <w:r>
-        <w:t>Para verificar el correcto funcionamiento del sistema se consideraron diferentes escenarios:</w:t>
-      </w:r>
+        </w:rPr>
+      </w:pPr>
+    </w:p>
+    <w:p>
+      <w:pPr>
+        <w:pStyle w:val="Prrafodelista"/>
+        <w:keepNext/>
+      </w:pPr>
+      <w:r>
+        <w:drawing>
+          <wp:inline distT="0" distB="0" distL="0" distR="0" wp14:anchorId="3846443B" wp14:editId="7FD3351F">
+            <wp:extent cx="4629796" cy="3200847"/>
+            <wp:effectExtent l="95250" t="95250" r="94615" b="95250"/>
+            <wp:docPr id="1774188516" name="Imagen 1" descr="Ilustración 3. Captura de pantalla del sistema, encontrando el problema, pero derivándolo a Nivel 2.&#10;"/>
+            <wp:cNvGraphicFramePr>
+              <a:graphicFrameLocks xmlns:a="http://schemas.openxmlformats.org/drawingml/2006/main" noChangeAspect="1"/>
+            </wp:cNvGraphicFramePr>
+            <a:graphic xmlns:a="http://schemas.openxmlformats.org/drawingml/2006/main">
+              <a:graphicData uri="http://schemas.openxmlformats.org/drawingml/2006/picture">
+                <pic:pic xmlns:pic="http://schemas.openxmlformats.org/drawingml/2006/picture">
+                  <pic:nvPicPr>
+                    <pic:cNvPr id="1774188516" name="Imagen 1" descr="Ilustración 3. Captura de pantalla del sistema, encontrando el problema, pero derivándolo a Nivel 2.&#10;"/>
+                    <pic:cNvPicPr/>
+                  </pic:nvPicPr>
+                  <pic:blipFill>
+                    <a:blip r:embed="rId9"/>
+                    <a:stretch>
+                      <a:fillRect/>
+                    </a:stretch>
+                  </pic:blipFill>
+                  <pic:spPr>
+                    <a:xfrm>
+                      <a:off x="0" y="0"/>
+                      <a:ext cx="4629796" cy="3200847"/>
+                    </a:xfrm>
+                    <a:prstGeom prst="rect">
+                      <a:avLst/>
+                    </a:prstGeom>
+                    <a:ln w="88900" cap="sq" cmpd="thickThin">
+                      <a:solidFill>
+                        <a:srgbClr val="000000"/>
+                      </a:solidFill>
+                      <a:prstDash val="solid"/>
+                      <a:miter lim="800000"/>
+                    </a:ln>
+                    <a:effectLst>
+                      <a:innerShdw blurRad="76200">
+                        <a:srgbClr val="000000"/>
+                      </a:innerShdw>
+                    </a:effectLst>
+                  </pic:spPr>
+                </pic:pic>
+              </a:graphicData>
+            </a:graphic>
+          </wp:inline>
+        </w:drawing>
+      </w:r>
+    </w:p>
+    <w:p>
+      <w:pPr>
+        <w:pStyle w:val="Descripcin"/>
+        <w:jc w:val="center"/>
+      </w:pPr>
+      <w:r>
+        <w:t xml:space="preserve">Ilustración </w:t>
+      </w:r>
+      <w:r>
+        <w:fldChar w:fldCharType="begin"/>
+      </w:r>
+      <w:r>
+        <w:instrText xml:space="preserve"> SEQ Ilustración \* ARABIC </w:instrText>
+      </w:r>
+      <w:r>
+        <w:fldChar w:fldCharType="separate"/>
+      </w:r>
+      <w:r>
+        <w:rPr>
+          <w:noProof/>
+        </w:rPr>
+        <w:t>3</w:t>
+      </w:r>
+      <w:r>
+        <w:fldChar w:fldCharType="end"/>
+      </w:r>
+      <w:r>
+        <w:t>. Captura de pantalla del sistema, encontrando el problema, pero derivándolo a Nivel 2.</w:t>
+      </w:r>
+    </w:p>
+    <w:p>
+      <w:pPr>
+        <w:pStyle w:val="Prrafodelista"/>
+      </w:pPr>
     </w:p>
     <w:p>
       <w:pPr>
@@ -1307,11 +2053,104 @@
           <w:b/>
           <w:bCs/>
         </w:rPr>
-        <w:t>Problema encontrado y resuelto:</w:t>
+        <w:t>Problema no registrado:</w:t>
       </w:r>
       <w:r>
         <w:br/>
-        <w:t>El sistema localiza una solución en la base de conocimientos y el usuario confirma que esta resolvió el inconveniente. El ticket se cierra correctamente.</w:t>
+        <w:t>El problema informado por el usuario no se encuentra en la base de conocimientos, por lo que el sistema deriva automáticamente el caso al soporte especializado.</w:t>
+      </w:r>
+    </w:p>
+    <w:p>
+      <w:pPr>
+        <w:pStyle w:val="Prrafodelista"/>
+      </w:pPr>
+    </w:p>
+    <w:p>
+      <w:pPr>
+        <w:pStyle w:val="Prrafodelista"/>
+        <w:keepNext/>
+        <w:jc w:val="both"/>
+      </w:pPr>
+      <w:r>
+        <w:drawing>
+          <wp:inline distT="0" distB="0" distL="0" distR="0" wp14:anchorId="5EF42EE9" wp14:editId="4AEA8A2E">
+            <wp:extent cx="5400040" cy="2783205"/>
+            <wp:effectExtent l="95250" t="95250" r="86360" b="93345"/>
+            <wp:docPr id="573712176" name="Imagen 1"/>
+            <wp:cNvGraphicFramePr>
+              <a:graphicFrameLocks xmlns:a="http://schemas.openxmlformats.org/drawingml/2006/main" noChangeAspect="1"/>
+            </wp:cNvGraphicFramePr>
+            <a:graphic xmlns:a="http://schemas.openxmlformats.org/drawingml/2006/main">
+              <a:graphicData uri="http://schemas.openxmlformats.org/drawingml/2006/picture">
+                <pic:pic xmlns:pic="http://schemas.openxmlformats.org/drawingml/2006/picture">
+                  <pic:nvPicPr>
+                    <pic:cNvPr id="573712176" name=""/>
+                    <pic:cNvPicPr/>
+                  </pic:nvPicPr>
+                  <pic:blipFill>
+                    <a:blip r:embed="rId10"/>
+                    <a:stretch>
+                      <a:fillRect/>
+                    </a:stretch>
+                  </pic:blipFill>
+                  <pic:spPr>
+                    <a:xfrm>
+                      <a:off x="0" y="0"/>
+                      <a:ext cx="5400040" cy="2783205"/>
+                    </a:xfrm>
+                    <a:prstGeom prst="rect">
+                      <a:avLst/>
+                    </a:prstGeom>
+                    <a:ln w="88900" cap="sq" cmpd="thickThin">
+                      <a:solidFill>
+                        <a:srgbClr val="000000"/>
+                      </a:solidFill>
+                      <a:prstDash val="solid"/>
+                      <a:miter lim="800000"/>
+                    </a:ln>
+                    <a:effectLst>
+                      <a:innerShdw blurRad="76200">
+                        <a:srgbClr val="000000"/>
+                      </a:innerShdw>
+                    </a:effectLst>
+                  </pic:spPr>
+                </pic:pic>
+              </a:graphicData>
+            </a:graphic>
+          </wp:inline>
+        </w:drawing>
+      </w:r>
+    </w:p>
+    <w:p>
+      <w:pPr>
+        <w:pStyle w:val="Descripcin"/>
+      </w:pPr>
+      <w:r>
+        <w:t xml:space="preserve">Ilustración </w:t>
+      </w:r>
+      <w:r>
+        <w:fldChar w:fldCharType="begin"/>
+      </w:r>
+      <w:r>
+        <w:instrText xml:space="preserve"> SEQ Ilustración \* ARABIC </w:instrText>
+      </w:r>
+      <w:r>
+        <w:fldChar w:fldCharType="separate"/>
+      </w:r>
+      <w:r>
+        <w:rPr>
+          <w:noProof/>
+        </w:rPr>
+        <w:t>4</w:t>
+      </w:r>
+      <w:r>
+        <w:fldChar w:fldCharType="end"/>
+      </w:r>
+      <w:r>
+        <w:t xml:space="preserve">. </w:t>
+      </w:r>
+      <w:r>
+        <w:t>Captura de pantalla de del sistema, en la cual este no encuentra el problema proporcionado y derivando a Nivel 2.</w:t>
       </w:r>
     </w:p>
     <w:p>
@@ -1327,60 +2166,7 @@
           <w:b/>
           <w:bCs/>
         </w:rPr>
-        <w:t xml:space="preserve">Problema </w:t>
-      </w:r>
-      <w:r>
-        <w:rPr>
-          <w:b/>
-          <w:bCs/>
-        </w:rPr>
-        <w:t>encontrado,</w:t>
-      </w:r>
-      <w:r>
-        <w:rPr>
-          <w:b/>
-          <w:bCs/>
-        </w:rPr>
-        <w:t xml:space="preserve"> pero no resuelto:</w:t>
-      </w:r>
-      <w:r>
-        <w:br/>
-        <w:t>El sistema propone una solución, pero el usuario indica que esta no solucionó el problema. El ticket es derivado al soporte de Nivel 2.</w:t>
-      </w:r>
-    </w:p>
-    <w:p>
-      <w:pPr>
-        <w:pStyle w:val="Prrafodelista"/>
-        <w:numPr>
-          <w:ilvl w:val="0"/>
-          <w:numId w:val="3"/>
-        </w:numPr>
-      </w:pPr>
-      <w:r>
-        <w:rPr>
-          <w:b/>
-          <w:bCs/>
-        </w:rPr>
-        <w:t>Problema no registrado:</w:t>
-      </w:r>
-      <w:r>
-        <w:br/>
-        <w:t>El problema informado por el usuario no se encuentra en la base de conocimientos, por lo que el sistema deriva automáticamente el caso al soporte especializado.</w:t>
-      </w:r>
-    </w:p>
-    <w:p>
-      <w:pPr>
-        <w:pStyle w:val="Prrafodelista"/>
-        <w:numPr>
-          <w:ilvl w:val="0"/>
-          <w:numId w:val="3"/>
-        </w:numPr>
-      </w:pPr>
-      <w:r>
-        <w:rPr>
-          <w:b/>
-          <w:bCs/>
-        </w:rPr>
+        <w:lastRenderedPageBreak/>
         <w:t>Datos incorrectos:</w:t>
       </w:r>
       <w:r>
@@ -1390,11 +2176,96 @@
     </w:p>
     <w:p>
       <w:pPr>
-        <w:rPr>
-          <w:sz w:val="24"/>
-          <w:szCs w:val="24"/>
-        </w:rPr>
-      </w:pPr>
+        <w:pStyle w:val="Prrafodelista"/>
+      </w:pPr>
+    </w:p>
+    <w:p>
+      <w:pPr>
+        <w:pStyle w:val="Prrafodelista"/>
+        <w:keepNext/>
+      </w:pPr>
+      <w:r>
+        <w:drawing>
+          <wp:inline distT="0" distB="0" distL="0" distR="0" wp14:anchorId="65A99F65" wp14:editId="05349270">
+            <wp:extent cx="5172797" cy="6001588"/>
+            <wp:effectExtent l="95250" t="95250" r="104140" b="94615"/>
+            <wp:docPr id="764536075" name="Imagen 1"/>
+            <wp:cNvGraphicFramePr>
+              <a:graphicFrameLocks xmlns:a="http://schemas.openxmlformats.org/drawingml/2006/main" noChangeAspect="1"/>
+            </wp:cNvGraphicFramePr>
+            <a:graphic xmlns:a="http://schemas.openxmlformats.org/drawingml/2006/main">
+              <a:graphicData uri="http://schemas.openxmlformats.org/drawingml/2006/picture">
+                <pic:pic xmlns:pic="http://schemas.openxmlformats.org/drawingml/2006/picture">
+                  <pic:nvPicPr>
+                    <pic:cNvPr id="764536075" name=""/>
+                    <pic:cNvPicPr/>
+                  </pic:nvPicPr>
+                  <pic:blipFill>
+                    <a:blip r:embed="rId11"/>
+                    <a:stretch>
+                      <a:fillRect/>
+                    </a:stretch>
+                  </pic:blipFill>
+                  <pic:spPr>
+                    <a:xfrm>
+                      <a:off x="0" y="0"/>
+                      <a:ext cx="5172797" cy="6001588"/>
+                    </a:xfrm>
+                    <a:prstGeom prst="rect">
+                      <a:avLst/>
+                    </a:prstGeom>
+                    <a:ln w="88900" cap="sq" cmpd="thickThin">
+                      <a:solidFill>
+                        <a:srgbClr val="000000"/>
+                      </a:solidFill>
+                      <a:prstDash val="solid"/>
+                      <a:miter lim="800000"/>
+                    </a:ln>
+                    <a:effectLst>
+                      <a:innerShdw blurRad="76200">
+                        <a:srgbClr val="000000"/>
+                      </a:innerShdw>
+                    </a:effectLst>
+                  </pic:spPr>
+                </pic:pic>
+              </a:graphicData>
+            </a:graphic>
+          </wp:inline>
+        </w:drawing>
+      </w:r>
+    </w:p>
+    <w:p>
+      <w:pPr>
+        <w:pStyle w:val="Descripcin"/>
+        <w:jc w:val="center"/>
+      </w:pPr>
+      <w:r>
+        <w:t xml:space="preserve">Ilustración </w:t>
+      </w:r>
+      <w:r>
+        <w:fldChar w:fldCharType="begin"/>
+      </w:r>
+      <w:r>
+        <w:instrText xml:space="preserve"> SEQ Ilustración \* ARABIC </w:instrText>
+      </w:r>
+      <w:r>
+        <w:fldChar w:fldCharType="separate"/>
+      </w:r>
+      <w:r>
+        <w:rPr>
+          <w:noProof/>
+        </w:rPr>
+        <w:t>5</w:t>
+      </w:r>
+      <w:r>
+        <w:fldChar w:fldCharType="end"/>
+      </w:r>
+      <w:r>
+        <w:t xml:space="preserve">. </w:t>
+      </w:r>
+      <w:r>
+        <w:t>Captura de pantalla de del sistema y su contemplación antes respuestas incorrectas e inválidas.</w:t>
+      </w:r>
     </w:p>
     <w:p>
       <w:pPr>
@@ -1584,7 +2455,9 @@
           <w:lang w:val="es-AR"/>
         </w:rPr>
       </w:pPr>
-      <w:r>
+    </w:p>
+    <w:p>
+      <w:pPr>
         <w:rPr>
           <w:b/>
           <w:bCs/>
@@ -1592,20 +2465,32 @@
           <w:szCs w:val="24"/>
           <w:lang w:val="es-AR"/>
         </w:rPr>
+      </w:pPr>
+    </w:p>
+    <w:p>
+      <w:pPr>
+        <w:rPr>
+          <w:b/>
+          <w:bCs/>
+          <w:sz w:val="24"/>
+          <w:szCs w:val="24"/>
+          <w:lang w:val="es-AR"/>
+        </w:rPr>
+      </w:pPr>
+      <w:r>
+        <w:rPr>
+          <w:b/>
+          <w:bCs/>
+          <w:sz w:val="24"/>
+          <w:szCs w:val="24"/>
+          <w:lang w:val="es-AR"/>
+        </w:rPr>
         <w:t>CONCLUSIONES</w:t>
       </w:r>
     </w:p>
     <w:p>
       <w:r>
-        <w:t xml:space="preserve">La implementación del </w:t>
-      </w:r>
-      <w:proofErr w:type="spellStart"/>
-      <w:r>
-        <w:t>chatbot</w:t>
-      </w:r>
-      <w:proofErr w:type="spellEnd"/>
-      <w:r>
-        <w:t xml:space="preserve"> de Soporte Técnico Nivel 1 permite automatizar la atención inicial de incidencias frecuentes, reduciendo los tiempos de respuesta y optimizando la utilización de los recursos del área de soporte.</w:t>
+        <w:t>La implementación del chatbot de Soporte Técnico Nivel 1 permite automatizar la atención inicial de incidencias frecuentes, reduciendo los tiempos de respuesta y optimizando la utilización de los recursos del área de soporte.</w:t>
       </w:r>
     </w:p>
     <w:p>
@@ -1619,13 +2504,194 @@
       </w:r>
     </w:p>
     <w:sectPr>
+      <w:footerReference w:type="default" r:id="rId12"/>
       <w:pgSz w:w="11906" w:h="16838"/>
-      <w:pgMar w:top="1417" w:right="1701" w:bottom="1417" w:left="1701" w:header="708" w:footer="708" w:gutter="0"/>
+      <w:pgMar w:top="993" w:right="1701" w:bottom="1276" w:left="1701" w:header="708" w:footer="0" w:gutter="0"/>
       <w:cols w:space="708"/>
       <w:docGrid w:linePitch="360"/>
     </w:sectPr>
   </w:body>
 </w:document>
+</file>
+
+<file path=word/endnotes.xml><?xml version="1.0" encoding="utf-8"?>
+<w:endnotes xmlns:wpc="http://schemas.microsoft.com/office/word/2010/wordprocessingCanvas" xmlns:cx="http://schemas.microsoft.com/office/drawing/2014/chartex" xmlns:cx1="http://schemas.microsoft.com/office/drawing/2015/9/8/chartex" xmlns:cx2="http://schemas.microsoft.com/office/drawing/2015/10/21/chartex" xmlns:cx3="http://schemas.microsoft.com/office/drawing/2016/5/9/chartex" xmlns:cx4="http://schemas.microsoft.com/office/drawing/2016/5/10/chartex" xmlns:cx5="http://schemas.microsoft.com/office/drawing/2016/5/11/chartex" xmlns:cx6="http://schemas.microsoft.com/office/drawing/2016/5/12/chartex" xmlns:cx7="http://schemas.microsoft.com/office/drawing/2016/5/13/chartex" xmlns:cx8="http://schemas.microsoft.com/office/drawing/2016/5/14/chartex" xmlns:mc="http://schemas.openxmlformats.org/markup-compatibility/2006" xmlns:aink="http://schemas.microsoft.com/office/drawing/2016/ink" xmlns:am3d="http://schemas.microsoft.com/office/drawing/2017/model3d" xmlns:o="urn:schemas-microsoft-com:office:office" xmlns:oel="http://schemas.microsoft.com/office/2019/extlst" xmlns:r="http://schemas.openxmlformats.org/officeDocument/2006/relationships" xmlns:m="http://schemas.openxmlformats.org/officeDocument/2006/math" xmlns:v="urn:schemas-microsoft-com:vml" xmlns:wp14="http://schemas.microsoft.com/office/word/2010/wordprocessingDrawing" xmlns:wp="http://schemas.openxmlformats.org/drawingml/2006/wordprocessingDrawing" xmlns:w10="urn:schemas-microsoft-com:office:word" xmlns:w="http://schemas.openxmlformats.org/wordprocessingml/2006/main" xmlns:w14="http://schemas.microsoft.com/office/word/2010/wordml" xmlns:w15="http://schemas.microsoft.com/office/word/2012/wordml" xmlns:w16cex="http://schemas.microsoft.com/office/word/2018/wordml/cex" xmlns:w16cid="http://schemas.microsoft.com/office/word/2016/wordml/cid" xmlns:w16="http://schemas.microsoft.com/office/word/2018/wordml" xmlns:w16du="http://schemas.microsoft.com/office/word/2023/wordml/word16du" xmlns:w16sdtdh="http://schemas.microsoft.com/office/word/2020/wordml/sdtdatahash" xmlns:w16sdtfl="http://schemas.microsoft.com/office/word/2024/wordml/sdtformatlock" xmlns:w16se="http://schemas.microsoft.com/office/word/2015/wordml/symex" xmlns:wpg="http://schemas.microsoft.com/office/word/2010/wordprocessingGroup" xmlns:wpi="http://schemas.microsoft.com/office/word/2010/wordprocessingInk" xmlns:wne="http://schemas.microsoft.com/office/word/2006/wordml" xmlns:wps="http://schemas.microsoft.com/office/word/2010/wordprocessingShape" mc:Ignorable="w14 w15 w16se w16cid w16 w16cex w16sdtdh w16sdtfl w16du wp14">
+  <w:endnote w:type="separator" w:id="-1">
+    <w:p>
+      <w:pPr>
+        <w:spacing w:after="0" w:line="240" w:lineRule="auto"/>
+      </w:pPr>
+      <w:r>
+        <w:separator/>
+      </w:r>
+    </w:p>
+  </w:endnote>
+  <w:endnote w:type="continuationSeparator" w:id="0">
+    <w:p>
+      <w:pPr>
+        <w:spacing w:after="0" w:line="240" w:lineRule="auto"/>
+      </w:pPr>
+      <w:r>
+        <w:continuationSeparator/>
+      </w:r>
+    </w:p>
+  </w:endnote>
+</w:endnotes>
+</file>
+
+<file path=word/footer1.xml><?xml version="1.0" encoding="utf-8"?>
+<w:ftr xmlns:wpc="http://schemas.microsoft.com/office/word/2010/wordprocessingCanvas" xmlns:cx="http://schemas.microsoft.com/office/drawing/2014/chartex" xmlns:cx1="http://schemas.microsoft.com/office/drawing/2015/9/8/chartex" xmlns:cx2="http://schemas.microsoft.com/office/drawing/2015/10/21/chartex" xmlns:cx3="http://schemas.microsoft.com/office/drawing/2016/5/9/chartex" xmlns:cx4="http://schemas.microsoft.com/office/drawing/2016/5/10/chartex" xmlns:cx5="http://schemas.microsoft.com/office/drawing/2016/5/11/chartex" xmlns:cx6="http://schemas.microsoft.com/office/drawing/2016/5/12/chartex" xmlns:cx7="http://schemas.microsoft.com/office/drawing/2016/5/13/chartex" xmlns:cx8="http://schemas.microsoft.com/office/drawing/2016/5/14/chartex" xmlns:mc="http://schemas.openxmlformats.org/markup-compatibility/2006" xmlns:aink="http://schemas.microsoft.com/office/drawing/2016/ink" xmlns:am3d="http://schemas.microsoft.com/office/drawing/2017/model3d" xmlns:o="urn:schemas-microsoft-com:office:office" xmlns:oel="http://schemas.microsoft.com/office/2019/extlst" xmlns:r="http://schemas.openxmlformats.org/officeDocument/2006/relationships" xmlns:m="http://schemas.openxmlformats.org/officeDocument/2006/math" xmlns:v="urn:schemas-microsoft-com:vml" xmlns:wp14="http://schemas.microsoft.com/office/word/2010/wordprocessingDrawing" xmlns:wp="http://schemas.openxmlformats.org/drawingml/2006/wordprocessingDrawing" xmlns:w10="urn:schemas-microsoft-com:office:word" xmlns:w="http://schemas.openxmlformats.org/wordprocessingml/2006/main" xmlns:w14="http://schemas.microsoft.com/office/word/2010/wordml" xmlns:w15="http://schemas.microsoft.com/office/word/2012/wordml" xmlns:w16cex="http://schemas.microsoft.com/office/word/2018/wordml/cex" xmlns:w16cid="http://schemas.microsoft.com/office/word/2016/wordml/cid" xmlns:w16="http://schemas.microsoft.com/office/word/2018/wordml" xmlns:w16du="http://schemas.microsoft.com/office/word/2023/wordml/word16du" xmlns:w16sdtdh="http://schemas.microsoft.com/office/word/2020/wordml/sdtdatahash" xmlns:w16sdtfl="http://schemas.microsoft.com/office/word/2024/wordml/sdtformatlock" xmlns:w16se="http://schemas.microsoft.com/office/word/2015/wordml/symex" xmlns:wpg="http://schemas.microsoft.com/office/word/2010/wordprocessingGroup" xmlns:wpi="http://schemas.microsoft.com/office/word/2010/wordprocessingInk" xmlns:wne="http://schemas.microsoft.com/office/word/2006/wordml" xmlns:wps="http://schemas.microsoft.com/office/word/2010/wordprocessingShape" mc:Ignorable="w14 w15 w16se w16cid w16 w16cex w16sdtdh w16sdtfl w16du wp14">
+  <w:p>
+    <w:pPr>
+      <w:tabs>
+        <w:tab w:val="center" w:pos="4550"/>
+        <w:tab w:val="left" w:pos="5818"/>
+      </w:tabs>
+      <w:ind w:right="260"/>
+      <w:jc w:val="right"/>
+      <w:rPr>
+        <w:color w:val="222A35" w:themeColor="text2" w:themeShade="80"/>
+        <w:sz w:val="24"/>
+        <w:szCs w:val="24"/>
+      </w:rPr>
+    </w:pPr>
+    <w:r>
+      <w:rPr>
+        <w:color w:val="8496B0" w:themeColor="text2" w:themeTint="99"/>
+        <w:spacing w:val="60"/>
+        <w:sz w:val="24"/>
+        <w:szCs w:val="24"/>
+      </w:rPr>
+      <w:t>Página</w:t>
+    </w:r>
+    <w:r>
+      <w:rPr>
+        <w:color w:val="8496B0" w:themeColor="text2" w:themeTint="99"/>
+        <w:sz w:val="24"/>
+        <w:szCs w:val="24"/>
+      </w:rPr>
+      <w:t xml:space="preserve"> </w:t>
+    </w:r>
+    <w:r>
+      <w:rPr>
+        <w:color w:val="323E4F" w:themeColor="text2" w:themeShade="BF"/>
+        <w:sz w:val="24"/>
+        <w:szCs w:val="24"/>
+      </w:rPr>
+      <w:fldChar w:fldCharType="begin"/>
+    </w:r>
+    <w:r>
+      <w:rPr>
+        <w:color w:val="323E4F" w:themeColor="text2" w:themeShade="BF"/>
+        <w:sz w:val="24"/>
+        <w:szCs w:val="24"/>
+      </w:rPr>
+      <w:instrText>PAGE   \* MERGEFORMAT</w:instrText>
+    </w:r>
+    <w:r>
+      <w:rPr>
+        <w:color w:val="323E4F" w:themeColor="text2" w:themeShade="BF"/>
+        <w:sz w:val="24"/>
+        <w:szCs w:val="24"/>
+      </w:rPr>
+      <w:fldChar w:fldCharType="separate"/>
+    </w:r>
+    <w:r>
+      <w:rPr>
+        <w:color w:val="323E4F" w:themeColor="text2" w:themeShade="BF"/>
+        <w:sz w:val="24"/>
+        <w:szCs w:val="24"/>
+      </w:rPr>
+      <w:t>1</w:t>
+    </w:r>
+    <w:r>
+      <w:rPr>
+        <w:color w:val="323E4F" w:themeColor="text2" w:themeShade="BF"/>
+        <w:sz w:val="24"/>
+        <w:szCs w:val="24"/>
+      </w:rPr>
+      <w:fldChar w:fldCharType="end"/>
+    </w:r>
+    <w:r>
+      <w:rPr>
+        <w:color w:val="323E4F" w:themeColor="text2" w:themeShade="BF"/>
+        <w:sz w:val="24"/>
+        <w:szCs w:val="24"/>
+      </w:rPr>
+      <w:t xml:space="preserve"> | </w:t>
+    </w:r>
+    <w:r>
+      <w:rPr>
+        <w:color w:val="323E4F" w:themeColor="text2" w:themeShade="BF"/>
+        <w:sz w:val="24"/>
+        <w:szCs w:val="24"/>
+      </w:rPr>
+      <w:fldChar w:fldCharType="begin"/>
+    </w:r>
+    <w:r>
+      <w:rPr>
+        <w:color w:val="323E4F" w:themeColor="text2" w:themeShade="BF"/>
+        <w:sz w:val="24"/>
+        <w:szCs w:val="24"/>
+      </w:rPr>
+      <w:instrText>NUMPAGES  \* Arabic  \* MERGEFORMAT</w:instrText>
+    </w:r>
+    <w:r>
+      <w:rPr>
+        <w:color w:val="323E4F" w:themeColor="text2" w:themeShade="BF"/>
+        <w:sz w:val="24"/>
+        <w:szCs w:val="24"/>
+      </w:rPr>
+      <w:fldChar w:fldCharType="separate"/>
+    </w:r>
+    <w:r>
+      <w:rPr>
+        <w:color w:val="323E4F" w:themeColor="text2" w:themeShade="BF"/>
+        <w:sz w:val="24"/>
+        <w:szCs w:val="24"/>
+      </w:rPr>
+      <w:t>1</w:t>
+    </w:r>
+    <w:r>
+      <w:rPr>
+        <w:color w:val="323E4F" w:themeColor="text2" w:themeShade="BF"/>
+        <w:sz w:val="24"/>
+        <w:szCs w:val="24"/>
+      </w:rPr>
+      <w:fldChar w:fldCharType="end"/>
+    </w:r>
+  </w:p>
+  <w:p>
+    <w:pPr>
+      <w:pStyle w:val="Piedepgina"/>
+    </w:pPr>
+  </w:p>
+</w:ftr>
+</file>
+
+<file path=word/footnotes.xml><?xml version="1.0" encoding="utf-8"?>
+<w:footnotes xmlns:wpc="http://schemas.microsoft.com/office/word/2010/wordprocessingCanvas" xmlns:cx="http://schemas.microsoft.com/office/drawing/2014/chartex" xmlns:cx1="http://schemas.microsoft.com/office/drawing/2015/9/8/chartex" xmlns:cx2="http://schemas.microsoft.com/office/drawing/2015/10/21/chartex" xmlns:cx3="http://schemas.microsoft.com/office/drawing/2016/5/9/chartex" xmlns:cx4="http://schemas.microsoft.com/office/drawing/2016/5/10/chartex" xmlns:cx5="http://schemas.microsoft.com/office/drawing/2016/5/11/chartex" xmlns:cx6="http://schemas.microsoft.com/office/drawing/2016/5/12/chartex" xmlns:cx7="http://schemas.microsoft.com/office/drawing/2016/5/13/chartex" xmlns:cx8="http://schemas.microsoft.com/office/drawing/2016/5/14/chartex" xmlns:mc="http://schemas.openxmlformats.org/markup-compatibility/2006" xmlns:aink="http://schemas.microsoft.com/office/drawing/2016/ink" xmlns:am3d="http://schemas.microsoft.com/office/drawing/2017/model3d" xmlns:o="urn:schemas-microsoft-com:office:office" xmlns:oel="http://schemas.microsoft.com/office/2019/extlst" xmlns:r="http://schemas.openxmlformats.org/officeDocument/2006/relationships" xmlns:m="http://schemas.openxmlformats.org/officeDocument/2006/math" xmlns:v="urn:schemas-microsoft-com:vml" xmlns:wp14="http://schemas.microsoft.com/office/word/2010/wordprocessingDrawing" xmlns:wp="http://schemas.openxmlformats.org/drawingml/2006/wordprocessingDrawing" xmlns:w10="urn:schemas-microsoft-com:office:word" xmlns:w="http://schemas.openxmlformats.org/wordprocessingml/2006/main" xmlns:w14="http://schemas.microsoft.com/office/word/2010/wordml" xmlns:w15="http://schemas.microsoft.com/office/word/2012/wordml" xmlns:w16cex="http://schemas.microsoft.com/office/word/2018/wordml/cex" xmlns:w16cid="http://schemas.microsoft.com/office/word/2016/wordml/cid" xmlns:w16="http://schemas.microsoft.com/office/word/2018/wordml" xmlns:w16du="http://schemas.microsoft.com/office/word/2023/wordml/word16du" xmlns:w16sdtdh="http://schemas.microsoft.com/office/word/2020/wordml/sdtdatahash" xmlns:w16sdtfl="http://schemas.microsoft.com/office/word/2024/wordml/sdtformatlock" xmlns:w16se="http://schemas.microsoft.com/office/word/2015/wordml/symex" xmlns:wpg="http://schemas.microsoft.com/office/word/2010/wordprocessingGroup" xmlns:wpi="http://schemas.microsoft.com/office/word/2010/wordprocessingInk" xmlns:wne="http://schemas.microsoft.com/office/word/2006/wordml" xmlns:wps="http://schemas.microsoft.com/office/word/2010/wordprocessingShape" mc:Ignorable="w14 w15 w16se w16cid w16 w16cex w16sdtdh w16sdtfl w16du wp14">
+  <w:footnote w:type="separator" w:id="-1">
+    <w:p>
+      <w:pPr>
+        <w:spacing w:after="0" w:line="240" w:lineRule="auto"/>
+      </w:pPr>
+      <w:r>
+        <w:separator/>
+      </w:r>
+    </w:p>
+  </w:footnote>
+  <w:footnote w:type="continuationSeparator" w:id="0">
+    <w:p>
+      <w:pPr>
+        <w:spacing w:after="0" w:line="240" w:lineRule="auto"/>
+      </w:pPr>
+      <w:r>
+        <w:continuationSeparator/>
+      </w:r>
+    </w:p>
+  </w:footnote>
+</w:footnotes>
 </file>
 
 <file path=word/numbering.xml><?xml version="1.0" encoding="utf-8"?>
@@ -3066,6 +4132,56 @@
       </w:tblBorders>
     </w:tblPr>
   </w:style>
+  <w:style w:type="paragraph" w:styleId="Encabezado">
+    <w:name w:val="header"/>
+    <w:basedOn w:val="Normal"/>
+    <w:link w:val="EncabezadoCar"/>
+    <w:uiPriority w:val="99"/>
+    <w:unhideWhenUsed/>
+    <w:rsid w:val="00386B9B"/>
+    <w:pPr>
+      <w:tabs>
+        <w:tab w:val="center" w:pos="4252"/>
+        <w:tab w:val="right" w:pos="8504"/>
+      </w:tabs>
+      <w:spacing w:after="0" w:line="240" w:lineRule="auto"/>
+    </w:pPr>
+  </w:style>
+  <w:style w:type="character" w:customStyle="1" w:styleId="EncabezadoCar">
+    <w:name w:val="Encabezado Car"/>
+    <w:basedOn w:val="Fuentedeprrafopredeter"/>
+    <w:link w:val="Encabezado"/>
+    <w:uiPriority w:val="99"/>
+    <w:rsid w:val="00386B9B"/>
+    <w:rPr>
+      <w:rFonts w:ascii="Times New Roman" w:hAnsi="Times New Roman"/>
+    </w:rPr>
+  </w:style>
+  <w:style w:type="paragraph" w:styleId="Piedepgina">
+    <w:name w:val="footer"/>
+    <w:basedOn w:val="Normal"/>
+    <w:link w:val="PiedepginaCar"/>
+    <w:uiPriority w:val="99"/>
+    <w:unhideWhenUsed/>
+    <w:rsid w:val="00386B9B"/>
+    <w:pPr>
+      <w:tabs>
+        <w:tab w:val="center" w:pos="4252"/>
+        <w:tab w:val="right" w:pos="8504"/>
+      </w:tabs>
+      <w:spacing w:after="0" w:line="240" w:lineRule="auto"/>
+    </w:pPr>
+  </w:style>
+  <w:style w:type="character" w:customStyle="1" w:styleId="PiedepginaCar">
+    <w:name w:val="Pie de página Car"/>
+    <w:basedOn w:val="Fuentedeprrafopredeter"/>
+    <w:link w:val="Piedepgina"/>
+    <w:uiPriority w:val="99"/>
+    <w:rsid w:val="00386B9B"/>
+    <w:rPr>
+      <w:rFonts w:ascii="Times New Roman" w:hAnsi="Times New Roman"/>
+    </w:rPr>
+  </w:style>
 </w:styles>
 </file>
 

</xml_diff>

<commit_message>
Update TPI - 7mo commit
Update del informe del TPI con nombres de integrantes y enlace a repositorio de GitHub
</commit_message>
<xml_diff>
--- a/Informe Trabajo Práctico Integrador - OE.docx
+++ b/Informe Trabajo Práctico Integrador - OE.docx
@@ -6,12 +6,28 @@
       <w:pPr>
         <w:pStyle w:val="Ttulo1"/>
         <w:jc w:val="center"/>
-        <w:rPr>
-          <w:lang w:val="es-AR"/>
-        </w:rPr>
-      </w:pPr>
-      <w:r>
-        <w:rPr>
+      </w:pPr>
+      <w:r>
+        <w:t>UNIVERSIDAD TECNOLÓGICA NACIONAL</w:t>
+      </w:r>
+    </w:p>
+    <w:p/>
+    <w:p>
+      <w:pPr>
+        <w:jc w:val="center"/>
+        <w:rPr>
+          <w:b/>
+          <w:bCs/>
+          <w:sz w:val="24"/>
+          <w:szCs w:val="24"/>
+        </w:rPr>
+      </w:pPr>
+      <w:r>
+        <w:rPr>
+          <w:b/>
+          <w:bCs/>
+          <w:sz w:val="24"/>
+          <w:szCs w:val="24"/>
           <w:lang w:val="es-AR"/>
         </w:rPr>
         <w:t>TRABAJO PRÁCTICO INTEGRADOR</w:t>
@@ -19,25 +35,135 @@
     </w:p>
     <w:p>
       <w:pPr>
+        <w:jc w:val="center"/>
+        <w:rPr>
+          <w:b/>
+          <w:bCs/>
+          <w:sz w:val="24"/>
+          <w:szCs w:val="24"/>
+        </w:rPr>
+      </w:pPr>
+      <w:r>
+        <w:rPr>
+          <w:b/>
+          <w:bCs/>
+          <w:sz w:val="24"/>
+          <w:szCs w:val="24"/>
+        </w:rPr>
+        <w:t>“</w:t>
+      </w:r>
+      <w:r>
+        <w:rPr>
+          <w:b/>
+          <w:bCs/>
+          <w:sz w:val="24"/>
+          <w:szCs w:val="24"/>
+        </w:rPr>
+        <w:t>CHATBOT DE SOPORTE TÉCNICO NIVEL 1</w:t>
+      </w:r>
+      <w:r>
+        <w:rPr>
+          <w:b/>
+          <w:bCs/>
+          <w:sz w:val="24"/>
+          <w:szCs w:val="24"/>
+        </w:rPr>
+        <w:t>”</w:t>
+      </w:r>
+    </w:p>
+    <w:p>
+      <w:pPr>
+        <w:jc w:val="center"/>
+        <w:rPr>
+          <w:b/>
+          <w:bCs/>
+          <w:sz w:val="28"/>
+          <w:szCs w:val="44"/>
+        </w:rPr>
+      </w:pPr>
+    </w:p>
+    <w:p>
+      <w:pPr>
+        <w:jc w:val="center"/>
+        <w:rPr>
+          <w:lang w:val="es-AR"/>
+        </w:rPr>
+      </w:pPr>
+      <w:r>
+        <w:rPr>
+          <w:b/>
+          <w:bCs/>
+          <w:sz w:val="24"/>
+          <w:szCs w:val="24"/>
+          <w:lang w:val="es-AR"/>
+        </w:rPr>
+        <w:t>ORGANIZACIÓN EMPRESARIAL</w:t>
+      </w:r>
+    </w:p>
+    <w:p>
+      <w:pPr>
+        <w:rPr>
+          <w:lang w:val="es-AR"/>
+        </w:rPr>
+      </w:pPr>
+    </w:p>
+    <w:p>
+      <w:pPr>
         <w:pStyle w:val="Ttulo1"/>
-        <w:jc w:val="center"/>
-        <w:rPr>
-          <w:lang w:val="es-AR"/>
-        </w:rPr>
-      </w:pPr>
-      <w:r>
-        <w:rPr>
-          <w:lang w:val="es-AR"/>
-        </w:rPr>
-        <w:t>ORGANIZACIÓN EMPRESARIAL</w:t>
-      </w:r>
-    </w:p>
-    <w:p>
-      <w:pPr>
-        <w:rPr>
-          <w:lang w:val="es-AR"/>
-        </w:rPr>
-      </w:pPr>
+        <w:rPr>
+          <w:lang w:val="es-AR"/>
+        </w:rPr>
+      </w:pPr>
+      <w:r>
+        <w:rPr>
+          <w:lang w:val="es-AR"/>
+        </w:rPr>
+        <w:t>INTEGRANTES</w:t>
+      </w:r>
+    </w:p>
+    <w:p>
+      <w:pPr>
+        <w:pStyle w:val="Prrafodelista"/>
+        <w:numPr>
+          <w:ilvl w:val="0"/>
+          <w:numId w:val="5"/>
+        </w:numPr>
+        <w:rPr>
+          <w:b/>
+          <w:bCs/>
+          <w:sz w:val="24"/>
+          <w:szCs w:val="24"/>
+          <w:lang w:val="es-AR"/>
+        </w:rPr>
+      </w:pPr>
+      <w:r>
+        <w:rPr>
+          <w:lang w:val="es-AR"/>
+        </w:rPr>
+        <w:t>Diego Schmied – Comisión 12</w:t>
+      </w:r>
+    </w:p>
+    <w:p>
+      <w:pPr>
+        <w:pStyle w:val="Prrafodelista"/>
+        <w:numPr>
+          <w:ilvl w:val="0"/>
+          <w:numId w:val="5"/>
+        </w:numPr>
+        <w:rPr>
+          <w:b/>
+          <w:bCs/>
+          <w:sz w:val="24"/>
+          <w:szCs w:val="24"/>
+          <w:lang w:val="es-AR"/>
+        </w:rPr>
+      </w:pPr>
+      <w:r>
+        <w:rPr>
+          <w:lang w:val="es-AR"/>
+        </w:rPr>
+        <w:t>Santino Maire – Comisión 21</w:t>
+      </w:r>
     </w:p>
     <w:p>
       <w:pPr>
@@ -64,14 +190,6 @@
     </w:p>
     <w:p>
       <w:pPr>
-        <w:rPr>
-          <w:sz w:val="24"/>
-          <w:szCs w:val="24"/>
-        </w:rPr>
-      </w:pPr>
-    </w:p>
-    <w:p>
-      <w:pPr>
         <w:pStyle w:val="Ttulo1"/>
       </w:pPr>
       <w:r>
@@ -95,14 +213,6 @@
     </w:p>
     <w:p>
       <w:pPr>
-        <w:rPr>
-          <w:sz w:val="24"/>
-          <w:szCs w:val="24"/>
-        </w:rPr>
-      </w:pPr>
-    </w:p>
-    <w:p>
-      <w:pPr>
         <w:pStyle w:val="Ttulo1"/>
       </w:pPr>
       <w:r>
@@ -118,14 +228,6 @@
       <w:r>
         <w:t>Por este motivo, se plantea la implementación de una solución basada en un chatbot que permita automatizar la atención inicial de los usuarios y optimizar el proceso de soporte técnico.</w:t>
       </w:r>
-    </w:p>
-    <w:p>
-      <w:pPr>
-        <w:rPr>
-          <w:sz w:val="24"/>
-          <w:szCs w:val="24"/>
-        </w:rPr>
-      </w:pPr>
     </w:p>
     <w:p>
       <w:pPr>
@@ -149,14 +251,6 @@
       <w:r>
         <w:t>En lugar de que un técnico atienda manualmente todos los casos, el usuario interactuará con un chatbot que intentará resolver automáticamente los problemas más frecuentes. Si no puede hacerlo, derivará el caso al soporte de Nivel 2.</w:t>
       </w:r>
-    </w:p>
-    <w:p>
-      <w:pPr>
-        <w:rPr>
-          <w:sz w:val="24"/>
-          <w:szCs w:val="24"/>
-        </w:rPr>
-      </w:pPr>
     </w:p>
     <w:p>
       <w:pPr>
@@ -214,7 +308,7 @@
                     </pic:cNvPicPr>
                   </pic:nvPicPr>
                   <pic:blipFill>
-                    <a:blip r:embed="rId7" cstate="print">
+                    <a:blip r:embed="rId8" cstate="print">
                       <a:extLst>
                         <a:ext uri="{28A0092B-C50C-407E-A947-70E740481C1C}">
                           <a14:useLocalDpi xmlns:a14="http://schemas.microsoft.com/office/drawing/2010/main" val="0"/>
@@ -523,12 +617,27 @@
           <w:lang w:val="es-AR"/>
         </w:rPr>
       </w:pPr>
-      <w:r>
+    </w:p>
+    <w:p>
+      <w:pPr>
         <w:rPr>
           <w:b/>
           <w:bCs/>
           <w:sz w:val="24"/>
           <w:szCs w:val="24"/>
+          <w:lang w:val="es-AR"/>
+        </w:rPr>
+      </w:pPr>
+    </w:p>
+    <w:p>
+      <w:pPr>
+        <w:pStyle w:val="Ttulo1"/>
+        <w:rPr>
+          <w:lang w:val="es-AR"/>
+        </w:rPr>
+      </w:pPr>
+      <w:r>
+        <w:rPr>
           <w:lang w:val="es-AR"/>
         </w:rPr>
         <w:lastRenderedPageBreak/>
@@ -935,30 +1044,13 @@
     </w:p>
     <w:p>
       <w:pPr>
-        <w:pStyle w:val="Prrafodelista"/>
-        <w:rPr>
-          <w:sz w:val="24"/>
-          <w:szCs w:val="24"/>
-          <w:lang w:val="es-AR"/>
-        </w:rPr>
-      </w:pPr>
-    </w:p>
-    <w:p>
-      <w:pPr>
-        <w:rPr>
-          <w:b/>
-          <w:bCs/>
-          <w:sz w:val="24"/>
-          <w:szCs w:val="24"/>
-          <w:lang w:val="es-AR"/>
-        </w:rPr>
-      </w:pPr>
-      <w:r>
-        <w:rPr>
-          <w:b/>
-          <w:bCs/>
-          <w:sz w:val="24"/>
-          <w:szCs w:val="24"/>
+        <w:pStyle w:val="Ttulo1"/>
+        <w:rPr>
+          <w:lang w:val="es-AR"/>
+        </w:rPr>
+      </w:pPr>
+      <w:r>
+        <w:rPr>
           <w:lang w:val="es-AR"/>
         </w:rPr>
         <w:t>DICCIONARIO DE DATOS</w:t>
@@ -1575,7 +1667,6 @@
               <w:rPr>
                 <w:lang w:val="es-AR"/>
               </w:rPr>
-              <w:lastRenderedPageBreak/>
               <w:t>problemas_path</w:t>
             </w:r>
           </w:p>
@@ -1627,20 +1718,16 @@
     </w:p>
     <w:p>
       <w:pPr>
-        <w:rPr>
-          <w:sz w:val="24"/>
-          <w:szCs w:val="24"/>
-          <w:lang w:val="es-AR"/>
-        </w:rPr>
-      </w:pPr>
-      <w:r>
-        <w:rPr>
-          <w:b/>
-          <w:bCs/>
-          <w:sz w:val="24"/>
-          <w:szCs w:val="24"/>
-          <w:lang w:val="es-AR"/>
-        </w:rPr>
+        <w:pStyle w:val="Ttulo1"/>
+        <w:rPr>
+          <w:lang w:val="es-AR"/>
+        </w:rPr>
+      </w:pPr>
+      <w:r>
+        <w:rPr>
+          <w:lang w:val="es-AR"/>
+        </w:rPr>
+        <w:lastRenderedPageBreak/>
         <w:t>MÁQUINA DE ESTADOS</w:t>
       </w:r>
     </w:p>
@@ -1786,20 +1873,13 @@
     </w:p>
     <w:p>
       <w:pPr>
-        <w:rPr>
-          <w:b/>
-          <w:bCs/>
-          <w:sz w:val="24"/>
-          <w:szCs w:val="24"/>
-          <w:lang w:val="es-AR"/>
-        </w:rPr>
-      </w:pPr>
-      <w:r>
-        <w:rPr>
-          <w:b/>
-          <w:bCs/>
-          <w:sz w:val="24"/>
-          <w:szCs w:val="24"/>
+        <w:pStyle w:val="Ttulo1"/>
+        <w:rPr>
+          <w:lang w:val="es-AR"/>
+        </w:rPr>
+      </w:pPr>
+      <w:r>
+        <w:rPr>
           <w:lang w:val="es-AR"/>
         </w:rPr>
         <w:t>PRUEBAS</w:t>
@@ -1841,6 +1921,9 @@
         <w:keepNext/>
       </w:pPr>
       <w:r>
+        <w:rPr>
+          <w:noProof/>
+        </w:rPr>
         <w:drawing>
           <wp:inline distT="0" distB="0" distL="0" distR="0" wp14:anchorId="24868F80" wp14:editId="1EDB1FD2">
             <wp:extent cx="4153480" cy="3181794"/>
@@ -1857,7 +1940,7 @@
                     <pic:cNvPicPr/>
                   </pic:nvPicPr>
                   <pic:blipFill>
-                    <a:blip r:embed="rId8"/>
+                    <a:blip r:embed="rId9"/>
                     <a:stretch>
                       <a:fillRect/>
                     </a:stretch>
@@ -1933,7 +2016,6 @@
           <w:b/>
           <w:bCs/>
         </w:rPr>
-        <w:lastRenderedPageBreak/>
         <w:t>Problema encontrado, pero no resuelto:</w:t>
       </w:r>
       <w:r>
@@ -1956,6 +2038,10 @@
         <w:keepNext/>
       </w:pPr>
       <w:r>
+        <w:rPr>
+          <w:noProof/>
+        </w:rPr>
+        <w:lastRenderedPageBreak/>
         <w:drawing>
           <wp:inline distT="0" distB="0" distL="0" distR="0" wp14:anchorId="3846443B" wp14:editId="7FD3351F">
             <wp:extent cx="4629796" cy="3200847"/>
@@ -1972,7 +2058,7 @@
                     <pic:cNvPicPr/>
                   </pic:nvPicPr>
                   <pic:blipFill>
-                    <a:blip r:embed="rId9"/>
+                    <a:blip r:embed="rId10"/>
                     <a:stretch>
                       <a:fillRect/>
                     </a:stretch>
@@ -2072,6 +2158,9 @@
         <w:jc w:val="both"/>
       </w:pPr>
       <w:r>
+        <w:rPr>
+          <w:noProof/>
+        </w:rPr>
         <w:drawing>
           <wp:inline distT="0" distB="0" distL="0" distR="0" wp14:anchorId="5EF42EE9" wp14:editId="4AEA8A2E">
             <wp:extent cx="5400040" cy="2783205"/>
@@ -2088,7 +2177,7 @@
                     <pic:cNvPicPr/>
                   </pic:nvPicPr>
                   <pic:blipFill>
-                    <a:blip r:embed="rId10"/>
+                    <a:blip r:embed="rId11"/>
                     <a:stretch>
                       <a:fillRect/>
                     </a:stretch>
@@ -2166,7 +2255,6 @@
           <w:b/>
           <w:bCs/>
         </w:rPr>
-        <w:lastRenderedPageBreak/>
         <w:t>Datos incorrectos:</w:t>
       </w:r>
       <w:r>
@@ -2185,6 +2273,10 @@
         <w:keepNext/>
       </w:pPr>
       <w:r>
+        <w:rPr>
+          <w:noProof/>
+        </w:rPr>
+        <w:lastRenderedPageBreak/>
         <w:drawing>
           <wp:inline distT="0" distB="0" distL="0" distR="0" wp14:anchorId="65A99F65" wp14:editId="05349270">
             <wp:extent cx="5172797" cy="6001588"/>
@@ -2201,7 +2293,7 @@
                     <pic:cNvPicPr/>
                   </pic:nvPicPr>
                   <pic:blipFill>
-                    <a:blip r:embed="rId11"/>
+                    <a:blip r:embed="rId12"/>
                     <a:stretch>
                       <a:fillRect/>
                     </a:stretch>
@@ -2269,20 +2361,13 @@
     </w:p>
     <w:p>
       <w:pPr>
-        <w:rPr>
-          <w:b/>
-          <w:bCs/>
-          <w:sz w:val="24"/>
-          <w:szCs w:val="24"/>
-          <w:lang w:val="es-AR"/>
-        </w:rPr>
-      </w:pPr>
-      <w:r>
-        <w:rPr>
-          <w:b/>
-          <w:bCs/>
-          <w:sz w:val="24"/>
-          <w:szCs w:val="24"/>
+        <w:pStyle w:val="Ttulo1"/>
+        <w:rPr>
+          <w:lang w:val="es-AR"/>
+        </w:rPr>
+      </w:pPr>
+      <w:r>
+        <w:rPr>
           <w:lang w:val="es-AR"/>
         </w:rPr>
         <w:t>MANUAL DE USUARIO</w:t>
@@ -2477,14 +2562,19 @@
           <w:lang w:val="es-AR"/>
         </w:rPr>
       </w:pPr>
-      <w:r>
-        <w:rPr>
-          <w:b/>
-          <w:bCs/>
-          <w:sz w:val="24"/>
-          <w:szCs w:val="24"/>
-          <w:lang w:val="es-AR"/>
-        </w:rPr>
+    </w:p>
+    <w:p>
+      <w:pPr>
+        <w:pStyle w:val="Ttulo1"/>
+        <w:rPr>
+          <w:lang w:val="es-AR"/>
+        </w:rPr>
+      </w:pPr>
+      <w:r>
+        <w:rPr>
+          <w:lang w:val="es-AR"/>
+        </w:rPr>
+        <w:lastRenderedPageBreak/>
         <w:t>CONCLUSIONES</w:t>
       </w:r>
     </w:p>
@@ -2503,10 +2593,65 @@
         <w:t>Además, el desarrollo del proyecto permitió aplicar conceptos relacionados con modelado de procesos mediante BPMN, estructuras de datos, máquinas de estados y programación en Python, integrando conocimientos adquiridos durante la cursada.</w:t>
       </w:r>
     </w:p>
+    <w:p/>
+    <w:p>
+      <w:pPr>
+        <w:pStyle w:val="Ttulo1"/>
+      </w:pPr>
+      <w:r>
+        <w:t>ENLACE AL REPOSITORIO DE GitHub</w:t>
+      </w:r>
+    </w:p>
+    <w:p>
+      <w:hyperlink r:id="rId13" w:history="1">
+        <w:r>
+          <w:rPr>
+            <w:rStyle w:val="Hipervnculo"/>
+          </w:rPr>
+          <w:t>https://github.com/diegoschmied/Trab</w:t>
+        </w:r>
+        <w:r>
+          <w:rPr>
+            <w:rStyle w:val="Hipervnculo"/>
+          </w:rPr>
+          <w:t>a</w:t>
+        </w:r>
+        <w:r>
+          <w:rPr>
+            <w:rStyle w:val="Hipervnculo"/>
+          </w:rPr>
+          <w:t>jo_Practi</w:t>
+        </w:r>
+        <w:r>
+          <w:rPr>
+            <w:rStyle w:val="Hipervnculo"/>
+          </w:rPr>
+          <w:t>c</w:t>
+        </w:r>
+        <w:r>
+          <w:rPr>
+            <w:rStyle w:val="Hipervnculo"/>
+          </w:rPr>
+          <w:t>o_Inte</w:t>
+        </w:r>
+        <w:r>
+          <w:rPr>
+            <w:rStyle w:val="Hipervnculo"/>
+          </w:rPr>
+          <w:t>g</w:t>
+        </w:r>
+        <w:r>
+          <w:rPr>
+            <w:rStyle w:val="Hipervnculo"/>
+          </w:rPr>
+          <w:t>rador-Programacion-1</w:t>
+        </w:r>
+      </w:hyperlink>
+    </w:p>
     <w:sectPr>
-      <w:footerReference w:type="default" r:id="rId12"/>
+      <w:footerReference w:type="default" r:id="rId14"/>
       <w:pgSz w:w="11906" w:h="16838"/>
-      <w:pgMar w:top="993" w:right="1701" w:bottom="1276" w:left="1701" w:header="708" w:footer="0" w:gutter="0"/>
+      <w:pgMar w:top="426" w:right="1701" w:bottom="1276" w:left="1701" w:header="708" w:footer="0" w:gutter="0"/>
       <w:cols w:space="708"/>
       <w:docGrid w:linePitch="360"/>
     </w:sectPr>
@@ -2697,6 +2842,118 @@
 <file path=word/numbering.xml><?xml version="1.0" encoding="utf-8"?>
 <w:numbering xmlns:wpc="http://schemas.microsoft.com/office/word/2010/wordprocessingCanvas" xmlns:cx="http://schemas.microsoft.com/office/drawing/2014/chartex" xmlns:cx1="http://schemas.microsoft.com/office/drawing/2015/9/8/chartex" xmlns:cx2="http://schemas.microsoft.com/office/drawing/2015/10/21/chartex" xmlns:cx3="http://schemas.microsoft.com/office/drawing/2016/5/9/chartex" xmlns:cx4="http://schemas.microsoft.com/office/drawing/2016/5/10/chartex" xmlns:cx5="http://schemas.microsoft.com/office/drawing/2016/5/11/chartex" xmlns:cx6="http://schemas.microsoft.com/office/drawing/2016/5/12/chartex" xmlns:cx7="http://schemas.microsoft.com/office/drawing/2016/5/13/chartex" xmlns:cx8="http://schemas.microsoft.com/office/drawing/2016/5/14/chartex" xmlns:mc="http://schemas.openxmlformats.org/markup-compatibility/2006" xmlns:aink="http://schemas.microsoft.com/office/drawing/2016/ink" xmlns:am3d="http://schemas.microsoft.com/office/drawing/2017/model3d" xmlns:o="urn:schemas-microsoft-com:office:office" xmlns:oel="http://schemas.microsoft.com/office/2019/extlst" xmlns:r="http://schemas.openxmlformats.org/officeDocument/2006/relationships" xmlns:m="http://schemas.openxmlformats.org/officeDocument/2006/math" xmlns:v="urn:schemas-microsoft-com:vml" xmlns:wp14="http://schemas.microsoft.com/office/word/2010/wordprocessingDrawing" xmlns:wp="http://schemas.openxmlformats.org/drawingml/2006/wordprocessingDrawing" xmlns:w10="urn:schemas-microsoft-com:office:word" xmlns:w="http://schemas.openxmlformats.org/wordprocessingml/2006/main" xmlns:w14="http://schemas.microsoft.com/office/word/2010/wordml" xmlns:w15="http://schemas.microsoft.com/office/word/2012/wordml" xmlns:w16cex="http://schemas.microsoft.com/office/word/2018/wordml/cex" xmlns:w16cid="http://schemas.microsoft.com/office/word/2016/wordml/cid" xmlns:w16="http://schemas.microsoft.com/office/word/2018/wordml" xmlns:w16du="http://schemas.microsoft.com/office/word/2023/wordml/word16du" xmlns:w16sdtdh="http://schemas.microsoft.com/office/word/2020/wordml/sdtdatahash" xmlns:w16sdtfl="http://schemas.microsoft.com/office/word/2024/wordml/sdtformatlock" xmlns:w16se="http://schemas.microsoft.com/office/word/2015/wordml/symex" xmlns:wpg="http://schemas.microsoft.com/office/word/2010/wordprocessingGroup" xmlns:wpi="http://schemas.microsoft.com/office/word/2010/wordprocessingInk" xmlns:wne="http://schemas.microsoft.com/office/word/2006/wordml" xmlns:wps="http://schemas.microsoft.com/office/word/2010/wordprocessingShape" mc:Ignorable="w14 w15 w16se w16cid w16 w16cex w16sdtdh w16sdtfl w16du wp14">
   <w:abstractNum w:abstractNumId="0" w15:restartNumberingAfterBreak="0">
+    <w:nsid w:val="0B492B29"/>
+    <w:multiLevelType w:val="hybridMultilevel"/>
+    <w:tmpl w:val="CCEAB1A6"/>
+    <w:lvl w:ilvl="0" w:tplc="496C4B5E">
+      <w:numFmt w:val="bullet"/>
+      <w:lvlText w:val=""/>
+      <w:lvlJc w:val="left"/>
+      <w:pPr>
+        <w:ind w:left="720" w:hanging="360"/>
+      </w:pPr>
+      <w:rPr>
+        <w:rFonts w:ascii="Symbol" w:eastAsiaTheme="minorHAnsi" w:hAnsi="Symbol" w:cstheme="minorBidi" w:hint="default"/>
+      </w:rPr>
+    </w:lvl>
+    <w:lvl w:ilvl="1" w:tplc="0C0A0003" w:tentative="1">
+      <w:start w:val="1"/>
+      <w:numFmt w:val="bullet"/>
+      <w:lvlText w:val="o"/>
+      <w:lvlJc w:val="left"/>
+      <w:pPr>
+        <w:ind w:left="1440" w:hanging="360"/>
+      </w:pPr>
+      <w:rPr>
+        <w:rFonts w:ascii="Courier New" w:hAnsi="Courier New" w:cs="Courier New" w:hint="default"/>
+      </w:rPr>
+    </w:lvl>
+    <w:lvl w:ilvl="2" w:tplc="0C0A0005" w:tentative="1">
+      <w:start w:val="1"/>
+      <w:numFmt w:val="bullet"/>
+      <w:lvlText w:val=""/>
+      <w:lvlJc w:val="left"/>
+      <w:pPr>
+        <w:ind w:left="2160" w:hanging="360"/>
+      </w:pPr>
+      <w:rPr>
+        <w:rFonts w:ascii="Wingdings" w:hAnsi="Wingdings" w:hint="default"/>
+      </w:rPr>
+    </w:lvl>
+    <w:lvl w:ilvl="3" w:tplc="0C0A0001" w:tentative="1">
+      <w:start w:val="1"/>
+      <w:numFmt w:val="bullet"/>
+      <w:lvlText w:val=""/>
+      <w:lvlJc w:val="left"/>
+      <w:pPr>
+        <w:ind w:left="2880" w:hanging="360"/>
+      </w:pPr>
+      <w:rPr>
+        <w:rFonts w:ascii="Symbol" w:hAnsi="Symbol" w:hint="default"/>
+      </w:rPr>
+    </w:lvl>
+    <w:lvl w:ilvl="4" w:tplc="0C0A0003" w:tentative="1">
+      <w:start w:val="1"/>
+      <w:numFmt w:val="bullet"/>
+      <w:lvlText w:val="o"/>
+      <w:lvlJc w:val="left"/>
+      <w:pPr>
+        <w:ind w:left="3600" w:hanging="360"/>
+      </w:pPr>
+      <w:rPr>
+        <w:rFonts w:ascii="Courier New" w:hAnsi="Courier New" w:cs="Courier New" w:hint="default"/>
+      </w:rPr>
+    </w:lvl>
+    <w:lvl w:ilvl="5" w:tplc="0C0A0005" w:tentative="1">
+      <w:start w:val="1"/>
+      <w:numFmt w:val="bullet"/>
+      <w:lvlText w:val=""/>
+      <w:lvlJc w:val="left"/>
+      <w:pPr>
+        <w:ind w:left="4320" w:hanging="360"/>
+      </w:pPr>
+      <w:rPr>
+        <w:rFonts w:ascii="Wingdings" w:hAnsi="Wingdings" w:hint="default"/>
+      </w:rPr>
+    </w:lvl>
+    <w:lvl w:ilvl="6" w:tplc="0C0A0001" w:tentative="1">
+      <w:start w:val="1"/>
+      <w:numFmt w:val="bullet"/>
+      <w:lvlText w:val=""/>
+      <w:lvlJc w:val="left"/>
+      <w:pPr>
+        <w:ind w:left="5040" w:hanging="360"/>
+      </w:pPr>
+      <w:rPr>
+        <w:rFonts w:ascii="Symbol" w:hAnsi="Symbol" w:hint="default"/>
+      </w:rPr>
+    </w:lvl>
+    <w:lvl w:ilvl="7" w:tplc="0C0A0003" w:tentative="1">
+      <w:start w:val="1"/>
+      <w:numFmt w:val="bullet"/>
+      <w:lvlText w:val="o"/>
+      <w:lvlJc w:val="left"/>
+      <w:pPr>
+        <w:ind w:left="5760" w:hanging="360"/>
+      </w:pPr>
+      <w:rPr>
+        <w:rFonts w:ascii="Courier New" w:hAnsi="Courier New" w:cs="Courier New" w:hint="default"/>
+      </w:rPr>
+    </w:lvl>
+    <w:lvl w:ilvl="8" w:tplc="0C0A0005" w:tentative="1">
+      <w:start w:val="1"/>
+      <w:numFmt w:val="bullet"/>
+      <w:lvlText w:val=""/>
+      <w:lvlJc w:val="left"/>
+      <w:pPr>
+        <w:ind w:left="6480" w:hanging="360"/>
+      </w:pPr>
+      <w:rPr>
+        <w:rFonts w:ascii="Wingdings" w:hAnsi="Wingdings" w:hint="default"/>
+      </w:rPr>
+    </w:lvl>
+  </w:abstractNum>
+  <w:abstractNum w:abstractNumId="1" w15:restartNumberingAfterBreak="0">
     <w:nsid w:val="32C4442D"/>
     <w:multiLevelType w:val="hybridMultilevel"/>
     <w:tmpl w:val="D9C61BB6"/>
@@ -2808,7 +3065,7 @@
       </w:rPr>
     </w:lvl>
   </w:abstractNum>
-  <w:abstractNum w:abstractNumId="1" w15:restartNumberingAfterBreak="0">
+  <w:abstractNum w:abstractNumId="2" w15:restartNumberingAfterBreak="0">
     <w:nsid w:val="39094C43"/>
     <w:multiLevelType w:val="hybridMultilevel"/>
     <w:tmpl w:val="1FF42F6E"/>
@@ -2921,7 +3178,7 @@
       </w:rPr>
     </w:lvl>
   </w:abstractNum>
-  <w:abstractNum w:abstractNumId="2" w15:restartNumberingAfterBreak="0">
+  <w:abstractNum w:abstractNumId="3" w15:restartNumberingAfterBreak="0">
     <w:nsid w:val="6D5B01AE"/>
     <w:multiLevelType w:val="multilevel"/>
     <w:tmpl w:val="48F07854"/>
@@ -3070,7 +3327,7 @@
       </w:rPr>
     </w:lvl>
   </w:abstractNum>
-  <w:abstractNum w:abstractNumId="3" w15:restartNumberingAfterBreak="0">
+  <w:abstractNum w:abstractNumId="4" w15:restartNumberingAfterBreak="0">
     <w:nsid w:val="799D3EAF"/>
     <w:multiLevelType w:val="hybridMultilevel"/>
     <w:tmpl w:val="7B642720"/>
@@ -3160,16 +3417,19 @@
     </w:lvl>
   </w:abstractNum>
   <w:num w:numId="1" w16cid:durableId="2118786589">
+    <w:abstractNumId w:val="2"/>
+  </w:num>
+  <w:num w:numId="2" w16cid:durableId="1472601486">
+    <w:abstractNumId w:val="3"/>
+  </w:num>
+  <w:num w:numId="3" w16cid:durableId="1908957426">
     <w:abstractNumId w:val="1"/>
   </w:num>
-  <w:num w:numId="2" w16cid:durableId="1472601486">
-    <w:abstractNumId w:val="2"/>
+  <w:num w:numId="4" w16cid:durableId="682586145">
+    <w:abstractNumId w:val="4"/>
   </w:num>
-  <w:num w:numId="3" w16cid:durableId="1908957426">
+  <w:num w:numId="5" w16cid:durableId="1389914329">
     <w:abstractNumId w:val="0"/>
-  </w:num>
-  <w:num w:numId="4" w16cid:durableId="682586145">
-    <w:abstractNumId w:val="3"/>
   </w:num>
 </w:numbering>
 </file>
@@ -4182,6 +4442,41 @@
       <w:rFonts w:ascii="Times New Roman" w:hAnsi="Times New Roman"/>
     </w:rPr>
   </w:style>
+  <w:style w:type="character" w:styleId="Hipervnculo">
+    <w:name w:val="Hyperlink"/>
+    <w:basedOn w:val="Fuentedeprrafopredeter"/>
+    <w:uiPriority w:val="99"/>
+    <w:unhideWhenUsed/>
+    <w:rsid w:val="000B43A4"/>
+    <w:rPr>
+      <w:color w:val="0563C1" w:themeColor="hyperlink"/>
+      <w:u w:val="single"/>
+    </w:rPr>
+  </w:style>
+  <w:style w:type="character" w:styleId="Mencinsinresolver">
+    <w:name w:val="Unresolved Mention"/>
+    <w:basedOn w:val="Fuentedeprrafopredeter"/>
+    <w:uiPriority w:val="99"/>
+    <w:semiHidden/>
+    <w:unhideWhenUsed/>
+    <w:rsid w:val="000B43A4"/>
+    <w:rPr>
+      <w:color w:val="605E5C"/>
+      <w:shd w:val="clear" w:color="auto" w:fill="E1DFDD"/>
+    </w:rPr>
+  </w:style>
+  <w:style w:type="character" w:styleId="Hipervnculovisitado">
+    <w:name w:val="FollowedHyperlink"/>
+    <w:basedOn w:val="Fuentedeprrafopredeter"/>
+    <w:uiPriority w:val="99"/>
+    <w:semiHidden/>
+    <w:unhideWhenUsed/>
+    <w:rsid w:val="000B43A4"/>
+    <w:rPr>
+      <w:color w:val="954F72" w:themeColor="followedHyperlink"/>
+      <w:u w:val="single"/>
+    </w:rPr>
+  </w:style>
 </w:styles>
 </file>
 
@@ -4478,4 +4773,16 @@
     </a:ext>
   </a:extLst>
 </a:theme>
+</file>
+
+<file path=customXml/item1.xml><?xml version="1.0" encoding="utf-8"?>
+<b:Sources xmlns:b="http://schemas.openxmlformats.org/officeDocument/2006/bibliography" xmlns="http://schemas.openxmlformats.org/officeDocument/2006/bibliography" SelectedStyle="\APASixthEditionOfficeOnline.xsl" StyleName="APA" Version="6"/>
+</file>
+
+<file path=customXml/itemProps1.xml><?xml version="1.0" encoding="utf-8"?>
+<ds:datastoreItem xmlns:ds="http://schemas.openxmlformats.org/officeDocument/2006/customXml" ds:itemID="{131BDABE-3A91-4207-AED0-52927844BB52}">
+  <ds:schemaRefs>
+    <ds:schemaRef ds:uri="http://schemas.openxmlformats.org/officeDocument/2006/bibliography"/>
+  </ds:schemaRefs>
+</ds:datastoreItem>
 </file>
</xml_diff>